<commit_message>
feat: Implement Phase 5 item 4 - Global automation toggle
Backend changes:
- Add endpoints: PUT /api/v1/automation/enable and /api/v1/automation/disable
- Add GET /api/v1/automation/global-status to check current state
- Add _check_grid_trading_enabled() method to AutomationEngine
- Automation cycle now checks grid_trading_enabled flag before running
- Update app_parameters table with enable/disable calls

Frontend changes:
- Create useGlobalAutomation hook with enable/disable/fetchStatus methods
- Update Sidebar with global automation toggle at top
- Status display: '🟢 Ativa' or '🔴 Inativa' with color-coded badge
- Add confirmation dialog for enable/disable actions
- Auto-refresh status every 30 seconds
- Disable toggle loading state during API call
</commit_message>
<xml_diff>
--- a/my prompts/My Prompts.docx
+++ b/my prompts/My Prompts.docx
@@ -12939,6 +12939,328 @@
         </w:rPr>
         <w:t xml:space="preserve"> base.</w:t>
       </w:r>
+    </w:p>
+    <w:p>
+      <w:pPr>
+        <w:rPr>
+          <w:rFonts w:ascii="Aptos" w:hAnsi="Aptos"/>
+          <w:sz w:val="20"/>
+          <w:szCs w:val="20"/>
+          <w:lang w:val="pt-PT"/>
+        </w:rPr>
+      </w:pPr>
+      <w:r>
+        <w:rPr>
+          <w:rFonts w:ascii="Aptos" w:hAnsi="Aptos"/>
+          <w:sz w:val="20"/>
+          <w:szCs w:val="20"/>
+          <w:lang w:val="pt-PT"/>
+        </w:rPr>
+        <w:br w:type="page"/>
+      </w:r>
+    </w:p>
+    <w:p>
+      <w:pPr>
+        <w:pStyle w:val="ListParagraph"/>
+        <w:numPr>
+          <w:ilvl w:val="0"/>
+          <w:numId w:val="3"/>
+        </w:numPr>
+        <w:spacing w:line="240" w:lineRule="auto"/>
+        <w:rPr>
+          <w:rFonts w:ascii="Aptos" w:hAnsi="Aptos"/>
+          <w:sz w:val="20"/>
+          <w:szCs w:val="20"/>
+          <w:lang w:val="pt-PT"/>
+        </w:rPr>
+      </w:pPr>
+      <w:r>
+        <w:rPr>
+          <w:rFonts w:ascii="Aptos" w:hAnsi="Aptos"/>
+          <w:sz w:val="20"/>
+          <w:szCs w:val="20"/>
+          <w:lang w:val="pt-PT"/>
+        </w:rPr>
+        <w:lastRenderedPageBreak/>
+        <w:t>No front-</w:t>
+      </w:r>
+      <w:proofErr w:type="spellStart"/>
+      <w:r>
+        <w:rPr>
+          <w:rFonts w:ascii="Aptos" w:hAnsi="Aptos"/>
+          <w:sz w:val="20"/>
+          <w:szCs w:val="20"/>
+          <w:lang w:val="pt-PT"/>
+        </w:rPr>
+        <w:t>end</w:t>
+      </w:r>
+      <w:proofErr w:type="spellEnd"/>
+      <w:r>
+        <w:rPr>
+          <w:rFonts w:ascii="Aptos" w:hAnsi="Aptos"/>
+          <w:sz w:val="20"/>
+          <w:szCs w:val="20"/>
+          <w:lang w:val="pt-PT"/>
+        </w:rPr>
+        <w:t xml:space="preserve"> da tabela de </w:t>
+      </w:r>
+      <w:proofErr w:type="spellStart"/>
+      <w:r>
+        <w:rPr>
+          <w:rFonts w:ascii="Aptos" w:hAnsi="Aptos"/>
+          <w:sz w:val="20"/>
+          <w:szCs w:val="20"/>
+          <w:lang w:val="pt-PT"/>
+        </w:rPr>
+        <w:t>ISINs</w:t>
+      </w:r>
+      <w:proofErr w:type="spellEnd"/>
+      <w:r>
+        <w:rPr>
+          <w:rFonts w:ascii="Aptos" w:hAnsi="Aptos"/>
+          <w:sz w:val="20"/>
+          <w:szCs w:val="20"/>
+          <w:lang w:val="pt-PT"/>
+        </w:rPr>
+        <w:t xml:space="preserve"> de</w:t>
+      </w:r>
+      <w:r>
+        <w:rPr>
+          <w:rFonts w:ascii="Aptos" w:hAnsi="Aptos"/>
+          <w:sz w:val="20"/>
+          <w:szCs w:val="20"/>
+          <w:lang w:val="pt-PT"/>
+        </w:rPr>
+        <w:t xml:space="preserve">ves manter a possibilidade do </w:t>
+      </w:r>
+      <w:proofErr w:type="spellStart"/>
+      <w:r>
+        <w:rPr>
+          <w:rFonts w:ascii="Aptos" w:hAnsi="Aptos"/>
+          <w:sz w:val="20"/>
+          <w:szCs w:val="20"/>
+          <w:lang w:val="pt-PT"/>
+        </w:rPr>
+        <w:t>toggle</w:t>
+      </w:r>
+      <w:proofErr w:type="spellEnd"/>
+      <w:r>
+        <w:rPr>
+          <w:rFonts w:ascii="Aptos" w:hAnsi="Aptos"/>
+          <w:sz w:val="20"/>
+          <w:szCs w:val="20"/>
+          <w:lang w:val="pt-PT"/>
+        </w:rPr>
+        <w:t xml:space="preserve"> como existe </w:t>
+      </w:r>
+      <w:proofErr w:type="gramStart"/>
+      <w:r>
+        <w:rPr>
+          <w:rFonts w:ascii="Aptos" w:hAnsi="Aptos"/>
+          <w:sz w:val="20"/>
+          <w:szCs w:val="20"/>
+          <w:lang w:val="pt-PT"/>
+        </w:rPr>
+        <w:t>hoje</w:t>
+      </w:r>
+      <w:proofErr w:type="gramEnd"/>
+      <w:r>
+        <w:rPr>
+          <w:rFonts w:ascii="Aptos" w:hAnsi="Aptos"/>
+          <w:sz w:val="20"/>
+          <w:szCs w:val="20"/>
+          <w:lang w:val="pt-PT"/>
+        </w:rPr>
+        <w:t xml:space="preserve"> mas adicionar uma nova forma de edição</w:t>
+      </w:r>
+    </w:p>
+    <w:p>
+      <w:pPr>
+        <w:pStyle w:val="ListParagraph"/>
+        <w:numPr>
+          <w:ilvl w:val="0"/>
+          <w:numId w:val="3"/>
+        </w:numPr>
+        <w:spacing w:line="240" w:lineRule="auto"/>
+        <w:rPr>
+          <w:rFonts w:ascii="Aptos" w:hAnsi="Aptos"/>
+          <w:sz w:val="20"/>
+          <w:szCs w:val="20"/>
+          <w:lang w:val="pt-PT"/>
+        </w:rPr>
+      </w:pPr>
+      <w:r>
+        <w:rPr>
+          <w:rFonts w:ascii="Aptos" w:hAnsi="Aptos"/>
+          <w:sz w:val="20"/>
+          <w:szCs w:val="20"/>
+          <w:lang w:val="pt-PT"/>
+        </w:rPr>
+        <w:t xml:space="preserve">Essa nova forma de edição, consiste em colocares um </w:t>
+      </w:r>
+      <w:proofErr w:type="spellStart"/>
+      <w:r>
+        <w:rPr>
+          <w:rFonts w:ascii="Aptos" w:hAnsi="Aptos"/>
+          <w:sz w:val="20"/>
+          <w:szCs w:val="20"/>
+          <w:lang w:val="pt-PT"/>
+        </w:rPr>
+        <w:t>icon</w:t>
+      </w:r>
+      <w:proofErr w:type="spellEnd"/>
+      <w:r>
+        <w:rPr>
+          <w:rFonts w:ascii="Aptos" w:hAnsi="Aptos"/>
+          <w:sz w:val="20"/>
+          <w:szCs w:val="20"/>
+          <w:lang w:val="pt-PT"/>
+        </w:rPr>
+        <w:t xml:space="preserve"> de edição apenas nas linhas da tabela em que a automação esteja ON</w:t>
+      </w:r>
+    </w:p>
+    <w:p>
+      <w:pPr>
+        <w:pStyle w:val="ListParagraph"/>
+        <w:numPr>
+          <w:ilvl w:val="0"/>
+          <w:numId w:val="3"/>
+        </w:numPr>
+        <w:spacing w:line="240" w:lineRule="auto"/>
+        <w:rPr>
+          <w:rFonts w:ascii="Aptos" w:hAnsi="Aptos"/>
+          <w:sz w:val="20"/>
+          <w:szCs w:val="20"/>
+          <w:lang w:val="pt-PT"/>
+        </w:rPr>
+      </w:pPr>
+      <w:r>
+        <w:rPr>
+          <w:rFonts w:ascii="Aptos" w:hAnsi="Aptos"/>
+          <w:sz w:val="20"/>
+          <w:szCs w:val="20"/>
+          <w:lang w:val="pt-PT"/>
+        </w:rPr>
+        <w:t xml:space="preserve">Quando se clica no botão de edição deves mostrar o </w:t>
+      </w:r>
+      <w:proofErr w:type="spellStart"/>
+      <w:r>
+        <w:rPr>
+          <w:rFonts w:ascii="Aptos" w:hAnsi="Aptos"/>
+          <w:sz w:val="20"/>
+          <w:szCs w:val="20"/>
+          <w:lang w:val="pt-PT"/>
+        </w:rPr>
+        <w:t>dialog</w:t>
+      </w:r>
+      <w:proofErr w:type="spellEnd"/>
+      <w:r>
+        <w:rPr>
+          <w:rFonts w:ascii="Aptos" w:hAnsi="Aptos"/>
+          <w:sz w:val="20"/>
+          <w:szCs w:val="20"/>
+          <w:lang w:val="pt-PT"/>
+        </w:rPr>
+        <w:t xml:space="preserve"> box, tal como quando fazes ON no </w:t>
+      </w:r>
+      <w:proofErr w:type="spellStart"/>
+      <w:r>
+        <w:rPr>
+          <w:rFonts w:ascii="Aptos" w:hAnsi="Aptos"/>
+          <w:sz w:val="20"/>
+          <w:szCs w:val="20"/>
+          <w:lang w:val="pt-PT"/>
+        </w:rPr>
+        <w:t>toggle</w:t>
+      </w:r>
+      <w:proofErr w:type="spellEnd"/>
+      <w:r>
+        <w:rPr>
+          <w:rFonts w:ascii="Aptos" w:hAnsi="Aptos"/>
+          <w:sz w:val="20"/>
+          <w:szCs w:val="20"/>
+          <w:lang w:val="pt-PT"/>
+        </w:rPr>
+        <w:t xml:space="preserve">. </w:t>
+      </w:r>
+    </w:p>
+    <w:p>
+      <w:pPr>
+        <w:pStyle w:val="ListParagraph"/>
+        <w:numPr>
+          <w:ilvl w:val="0"/>
+          <w:numId w:val="3"/>
+        </w:numPr>
+        <w:spacing w:line="240" w:lineRule="auto"/>
+        <w:rPr>
+          <w:rFonts w:ascii="Aptos" w:hAnsi="Aptos"/>
+          <w:sz w:val="20"/>
+          <w:szCs w:val="20"/>
+          <w:lang w:val="pt-PT"/>
+        </w:rPr>
+      </w:pPr>
+      <w:r>
+        <w:rPr>
+          <w:rFonts w:ascii="Aptos" w:hAnsi="Aptos"/>
+          <w:sz w:val="20"/>
+          <w:szCs w:val="20"/>
+          <w:lang w:val="pt-PT"/>
+        </w:rPr>
+        <w:t xml:space="preserve">No </w:t>
+      </w:r>
+      <w:proofErr w:type="spellStart"/>
+      <w:r>
+        <w:rPr>
+          <w:rFonts w:ascii="Aptos" w:hAnsi="Aptos"/>
+          <w:sz w:val="20"/>
+          <w:szCs w:val="20"/>
+          <w:lang w:val="pt-PT"/>
+        </w:rPr>
+        <w:t>Dialog</w:t>
+      </w:r>
+      <w:proofErr w:type="spellEnd"/>
+      <w:r>
+        <w:rPr>
+          <w:rFonts w:ascii="Aptos" w:hAnsi="Aptos"/>
+          <w:sz w:val="20"/>
+          <w:szCs w:val="20"/>
+          <w:lang w:val="pt-PT"/>
+        </w:rPr>
+        <w:t xml:space="preserve"> box que apresentas (seja quando clicas no </w:t>
+      </w:r>
+      <w:proofErr w:type="spellStart"/>
+      <w:r>
+        <w:rPr>
+          <w:rFonts w:ascii="Aptos" w:hAnsi="Aptos"/>
+          <w:sz w:val="20"/>
+          <w:szCs w:val="20"/>
+          <w:lang w:val="pt-PT"/>
+        </w:rPr>
+        <w:t>switch</w:t>
+      </w:r>
+      <w:proofErr w:type="spellEnd"/>
+      <w:r>
+        <w:rPr>
+          <w:rFonts w:ascii="Aptos" w:hAnsi="Aptos"/>
+          <w:sz w:val="20"/>
+          <w:szCs w:val="20"/>
+          <w:lang w:val="pt-PT"/>
+        </w:rPr>
+        <w:t>, seja no botão de edição), tens de adicionar o campo “Investimento Inicial (EUR)”</w:t>
+      </w:r>
+    </w:p>
+    <w:p>
+      <w:pPr>
+        <w:pStyle w:val="ListParagraph"/>
+        <w:spacing w:line="240" w:lineRule="auto"/>
+        <w:ind w:left="360"/>
+        <w:rPr>
+          <w:rFonts w:ascii="Aptos" w:hAnsi="Aptos"/>
+          <w:sz w:val="20"/>
+          <w:szCs w:val="20"/>
+          <w:lang w:val="pt-PT"/>
+        </w:rPr>
+      </w:pPr>
     </w:p>
     <w:sectPr>
       <w:pgSz w:w="12240" w:h="15840"/>
@@ -13089,6 +13411,92 @@
     </w:lvl>
   </w:abstractNum>
   <w:abstractNum w:abstractNumId="1" w15:restartNumberingAfterBreak="0">
+    <w:nsid w:val="53761217"/>
+    <w:multiLevelType w:val="multilevel"/>
+    <w:tmpl w:val="0409001F"/>
+    <w:lvl w:ilvl="0">
+      <w:start w:val="1"/>
+      <w:numFmt w:val="decimal"/>
+      <w:lvlText w:val="%1."/>
+      <w:lvlJc w:val="left"/>
+      <w:pPr>
+        <w:ind w:left="360" w:hanging="360"/>
+      </w:pPr>
+    </w:lvl>
+    <w:lvl w:ilvl="1">
+      <w:start w:val="1"/>
+      <w:numFmt w:val="decimal"/>
+      <w:lvlText w:val="%1.%2."/>
+      <w:lvlJc w:val="left"/>
+      <w:pPr>
+        <w:ind w:left="792" w:hanging="432"/>
+      </w:pPr>
+    </w:lvl>
+    <w:lvl w:ilvl="2">
+      <w:start w:val="1"/>
+      <w:numFmt w:val="decimal"/>
+      <w:lvlText w:val="%1.%2.%3."/>
+      <w:lvlJc w:val="left"/>
+      <w:pPr>
+        <w:ind w:left="1224" w:hanging="504"/>
+      </w:pPr>
+    </w:lvl>
+    <w:lvl w:ilvl="3">
+      <w:start w:val="1"/>
+      <w:numFmt w:val="decimal"/>
+      <w:lvlText w:val="%1.%2.%3.%4."/>
+      <w:lvlJc w:val="left"/>
+      <w:pPr>
+        <w:ind w:left="1728" w:hanging="648"/>
+      </w:pPr>
+    </w:lvl>
+    <w:lvl w:ilvl="4">
+      <w:start w:val="1"/>
+      <w:numFmt w:val="decimal"/>
+      <w:lvlText w:val="%1.%2.%3.%4.%5."/>
+      <w:lvlJc w:val="left"/>
+      <w:pPr>
+        <w:ind w:left="2232" w:hanging="792"/>
+      </w:pPr>
+    </w:lvl>
+    <w:lvl w:ilvl="5">
+      <w:start w:val="1"/>
+      <w:numFmt w:val="decimal"/>
+      <w:lvlText w:val="%1.%2.%3.%4.%5.%6."/>
+      <w:lvlJc w:val="left"/>
+      <w:pPr>
+        <w:ind w:left="2736" w:hanging="936"/>
+      </w:pPr>
+    </w:lvl>
+    <w:lvl w:ilvl="6">
+      <w:start w:val="1"/>
+      <w:numFmt w:val="decimal"/>
+      <w:lvlText w:val="%1.%2.%3.%4.%5.%6.%7."/>
+      <w:lvlJc w:val="left"/>
+      <w:pPr>
+        <w:ind w:left="3240" w:hanging="1080"/>
+      </w:pPr>
+    </w:lvl>
+    <w:lvl w:ilvl="7">
+      <w:start w:val="1"/>
+      <w:numFmt w:val="decimal"/>
+      <w:lvlText w:val="%1.%2.%3.%4.%5.%6.%7.%8."/>
+      <w:lvlJc w:val="left"/>
+      <w:pPr>
+        <w:ind w:left="3744" w:hanging="1224"/>
+      </w:pPr>
+    </w:lvl>
+    <w:lvl w:ilvl="8">
+      <w:start w:val="1"/>
+      <w:numFmt w:val="decimal"/>
+      <w:lvlText w:val="%1.%2.%3.%4.%5.%6.%7.%8.%9."/>
+      <w:lvlJc w:val="left"/>
+      <w:pPr>
+        <w:ind w:left="4320" w:hanging="1440"/>
+      </w:pPr>
+    </w:lvl>
+  </w:abstractNum>
+  <w:abstractNum w:abstractNumId="2" w15:restartNumberingAfterBreak="0">
     <w:nsid w:val="6BC9446F"/>
     <w:multiLevelType w:val="hybridMultilevel"/>
     <w:tmpl w:val="AE80D6BE"/>
@@ -13181,6 +13589,9 @@
     <w:abstractNumId w:val="0"/>
   </w:num>
   <w:num w:numId="2" w16cid:durableId="1653177884">
+    <w:abstractNumId w:val="2"/>
+  </w:num>
+  <w:num w:numId="3" w16cid:durableId="480393448">
     <w:abstractNumId w:val="1"/>
   </w:num>
 </w:numbering>

</xml_diff>

<commit_message>
fix: Add visible error message for duplicate strategy names
- Add createStrategyError state to track error messages
- Display error in red box inside New Strategy dialog with AlertCircle icon
- Clear error when dialog opens/closes and after successful creation
- User now gets immediate feedback for duplicate name or other creation errors

Co-Authored-By: Claude Code <noreply@anthropic.com>
</commit_message>
<xml_diff>
--- a/my prompts/My Prompts.docx
+++ b/my prompts/My Prompts.docx
@@ -12982,17 +12982,17 @@
           <w:lang w:val="pt-PT"/>
         </w:rPr>
         <w:lastRenderedPageBreak/>
-        <w:t>No front-</w:t>
-      </w:r>
-      <w:proofErr w:type="spellStart"/>
-      <w:r>
-        <w:rPr>
-          <w:rFonts w:ascii="Aptos" w:hAnsi="Aptos"/>
-          <w:sz w:val="20"/>
-          <w:szCs w:val="20"/>
-          <w:lang w:val="pt-PT"/>
-        </w:rPr>
-        <w:t>end</w:t>
+        <w:t xml:space="preserve">No </w:t>
+      </w:r>
+      <w:proofErr w:type="spellStart"/>
+      <w:r>
+        <w:rPr>
+          <w:rFonts w:ascii="Aptos" w:hAnsi="Aptos"/>
+          <w:sz w:val="20"/>
+          <w:szCs w:val="20"/>
+          <w:lang w:val="pt-PT"/>
+        </w:rPr>
+        <w:t>front-end</w:t>
       </w:r>
       <w:proofErr w:type="spellEnd"/>
       <w:r>
@@ -13251,7 +13251,1671 @@
     </w:p>
     <w:p>
       <w:pPr>
-        <w:pStyle w:val="ListParagraph"/>
+        <w:rPr>
+          <w:rFonts w:ascii="Aptos" w:hAnsi="Aptos"/>
+          <w:sz w:val="20"/>
+          <w:szCs w:val="20"/>
+          <w:lang w:val="pt-PT"/>
+        </w:rPr>
+      </w:pPr>
+      <w:r>
+        <w:rPr>
+          <w:rFonts w:ascii="Aptos" w:hAnsi="Aptos"/>
+          <w:sz w:val="20"/>
+          <w:szCs w:val="20"/>
+          <w:lang w:val="pt-PT"/>
+        </w:rPr>
+        <w:br w:type="page"/>
+      </w:r>
+    </w:p>
+    <w:p>
+      <w:pPr>
+        <w:pStyle w:val="ListParagraph"/>
+        <w:spacing w:line="240" w:lineRule="auto"/>
+        <w:ind w:left="360"/>
+        <w:rPr>
+          <w:rFonts w:ascii="Aptos" w:hAnsi="Aptos"/>
+          <w:sz w:val="20"/>
+          <w:szCs w:val="20"/>
+          <w:lang w:val="pt-PT"/>
+        </w:rPr>
+      </w:pPr>
+      <w:r>
+        <w:rPr>
+          <w:rFonts w:ascii="Aptos" w:hAnsi="Aptos"/>
+          <w:sz w:val="20"/>
+          <w:szCs w:val="20"/>
+          <w:lang w:val="pt-PT"/>
+        </w:rPr>
+        <w:lastRenderedPageBreak/>
+        <w:t xml:space="preserve">Alteração ao </w:t>
+      </w:r>
+      <w:proofErr w:type="spellStart"/>
+      <w:r>
+        <w:rPr>
+          <w:rFonts w:ascii="Aptos" w:hAnsi="Aptos"/>
+          <w:sz w:val="20"/>
+          <w:szCs w:val="20"/>
+          <w:lang w:val="pt-PT"/>
+        </w:rPr>
+        <w:t>Automation</w:t>
+      </w:r>
+      <w:proofErr w:type="spellEnd"/>
+      <w:r>
+        <w:rPr>
+          <w:rFonts w:ascii="Aptos" w:hAnsi="Aptos"/>
+          <w:sz w:val="20"/>
+          <w:szCs w:val="20"/>
+          <w:lang w:val="pt-PT"/>
+        </w:rPr>
+        <w:t xml:space="preserve"> </w:t>
+      </w:r>
+      <w:proofErr w:type="spellStart"/>
+      <w:r>
+        <w:rPr>
+          <w:rFonts w:ascii="Aptos" w:hAnsi="Aptos"/>
+          <w:sz w:val="20"/>
+          <w:szCs w:val="20"/>
+          <w:lang w:val="pt-PT"/>
+        </w:rPr>
+        <w:t>Engine</w:t>
+      </w:r>
+      <w:proofErr w:type="spellEnd"/>
+      <w:r>
+        <w:rPr>
+          <w:rFonts w:ascii="Aptos" w:hAnsi="Aptos"/>
+          <w:sz w:val="20"/>
+          <w:szCs w:val="20"/>
+          <w:lang w:val="pt-PT"/>
+        </w:rPr>
+        <w:t xml:space="preserve"> </w:t>
+      </w:r>
+      <w:proofErr w:type="spellStart"/>
+      <w:r>
+        <w:rPr>
+          <w:rFonts w:ascii="Aptos" w:hAnsi="Aptos"/>
+          <w:sz w:val="20"/>
+          <w:szCs w:val="20"/>
+          <w:lang w:val="pt-PT"/>
+        </w:rPr>
+        <w:t>Logic</w:t>
+      </w:r>
+      <w:proofErr w:type="spellEnd"/>
+      <w:r>
+        <w:rPr>
+          <w:rFonts w:ascii="Aptos" w:hAnsi="Aptos"/>
+          <w:sz w:val="20"/>
+          <w:szCs w:val="20"/>
+          <w:lang w:val="pt-PT"/>
+        </w:rPr>
+        <w:t xml:space="preserve">. </w:t>
+      </w:r>
+      <w:r>
+        <w:rPr>
+          <w:rFonts w:ascii="Aptos" w:hAnsi="Aptos"/>
+          <w:sz w:val="20"/>
+          <w:szCs w:val="20"/>
+          <w:lang w:val="pt-PT"/>
+        </w:rPr>
+        <w:t xml:space="preserve">Introduz as alterações marcadas </w:t>
+      </w:r>
+      <w:proofErr w:type="gramStart"/>
+      <w:r>
+        <w:rPr>
+          <w:rFonts w:ascii="Aptos" w:hAnsi="Aptos"/>
+          <w:sz w:val="20"/>
+          <w:szCs w:val="20"/>
+          <w:lang w:val="pt-PT"/>
+        </w:rPr>
+        <w:t xml:space="preserve">com </w:t>
+      </w:r>
+      <w:r>
+        <w:rPr>
+          <w:rFonts w:ascii="Aptos" w:hAnsi="Aptos"/>
+          <w:sz w:val="20"/>
+          <w:szCs w:val="20"/>
+          <w:lang w:val="pt-PT"/>
+        </w:rPr>
+        <w:t xml:space="preserve"> [</w:t>
+      </w:r>
+      <w:proofErr w:type="gramEnd"/>
+      <w:r>
+        <w:rPr>
+          <w:rFonts w:ascii="Aptos" w:hAnsi="Aptos"/>
+          <w:sz w:val="20"/>
+          <w:szCs w:val="20"/>
+          <w:lang w:val="pt-PT"/>
+        </w:rPr>
+        <w:t>NEW]</w:t>
+      </w:r>
+    </w:p>
+    <w:p>
+      <w:pPr>
+        <w:pStyle w:val="ListParagraph"/>
+        <w:ind w:left="360"/>
+        <w:rPr>
+          <w:rFonts w:ascii="Aptos" w:hAnsi="Aptos"/>
+          <w:b/>
+          <w:bCs/>
+          <w:sz w:val="20"/>
+          <w:szCs w:val="20"/>
+          <w:lang w:val="pt-PT"/>
+        </w:rPr>
+      </w:pPr>
+    </w:p>
+    <w:p>
+      <w:pPr>
+        <w:pStyle w:val="ListParagraph"/>
+        <w:ind w:left="360"/>
+        <w:rPr>
+          <w:rFonts w:ascii="Aptos" w:hAnsi="Aptos"/>
+          <w:b/>
+          <w:bCs/>
+          <w:sz w:val="20"/>
+          <w:szCs w:val="20"/>
+        </w:rPr>
+      </w:pPr>
+      <w:r>
+        <w:rPr>
+          <w:rFonts w:ascii="Aptos" w:hAnsi="Aptos"/>
+          <w:b/>
+          <w:bCs/>
+          <w:sz w:val="20"/>
+          <w:szCs w:val="20"/>
+        </w:rPr>
+        <w:t>Phase 1: Initial Setup</w:t>
+      </w:r>
+    </w:p>
+    <w:p>
+      <w:pPr>
+        <w:pStyle w:val="ListParagraph"/>
+        <w:spacing w:line="240" w:lineRule="auto"/>
+        <w:ind w:left="360"/>
+        <w:rPr>
+          <w:rFonts w:ascii="Aptos" w:hAnsi="Aptos"/>
+          <w:sz w:val="20"/>
+          <w:szCs w:val="20"/>
+        </w:rPr>
+      </w:pPr>
+      <w:r>
+        <w:rPr>
+          <w:rFonts w:ascii="Aptos" w:hAnsi="Aptos"/>
+          <w:sz w:val="20"/>
+          <w:szCs w:val="20"/>
+        </w:rPr>
+        <w:t xml:space="preserve">Para </w:t>
+      </w:r>
+      <w:proofErr w:type="spellStart"/>
+      <w:r>
+        <w:rPr>
+          <w:rFonts w:ascii="Aptos" w:hAnsi="Aptos"/>
+          <w:sz w:val="20"/>
+          <w:szCs w:val="20"/>
+        </w:rPr>
+        <w:t>cada</w:t>
+      </w:r>
+      <w:proofErr w:type="spellEnd"/>
+      <w:r>
+        <w:rPr>
+          <w:rFonts w:ascii="Aptos" w:hAnsi="Aptos"/>
+          <w:sz w:val="20"/>
+          <w:szCs w:val="20"/>
+        </w:rPr>
+        <w:t xml:space="preserve"> ISIN com </w:t>
+      </w:r>
+      <w:proofErr w:type="spellStart"/>
+      <w:r>
+        <w:rPr>
+          <w:rFonts w:ascii="Aptos" w:hAnsi="Aptos"/>
+          <w:sz w:val="20"/>
+          <w:szCs w:val="20"/>
+        </w:rPr>
+        <w:t>initial_trade</w:t>
+      </w:r>
+      <w:proofErr w:type="spellEnd"/>
+      <w:r>
+        <w:rPr>
+          <w:rFonts w:ascii="Aptos" w:hAnsi="Aptos"/>
+          <w:sz w:val="20"/>
+          <w:szCs w:val="20"/>
+        </w:rPr>
+        <w:t>=TRUE:</w:t>
+      </w:r>
+    </w:p>
+    <w:p>
+      <w:pPr>
+        <w:pStyle w:val="ListParagraph"/>
+        <w:spacing w:line="240" w:lineRule="auto"/>
+        <w:ind w:left="360"/>
+        <w:rPr>
+          <w:rFonts w:ascii="Aptos" w:hAnsi="Aptos"/>
+          <w:sz w:val="20"/>
+          <w:szCs w:val="20"/>
+          <w:lang w:val="pt-PT"/>
+        </w:rPr>
+      </w:pPr>
+      <w:r>
+        <w:rPr>
+          <w:rFonts w:ascii="Aptos" w:hAnsi="Aptos"/>
+          <w:sz w:val="20"/>
+          <w:szCs w:val="20"/>
+          <w:lang w:val="pt-PT"/>
+        </w:rPr>
+        <w:t xml:space="preserve">  1. Carregar </w:t>
+      </w:r>
+      <w:proofErr w:type="spellStart"/>
+      <w:r>
+        <w:rPr>
+          <w:rFonts w:ascii="Aptos" w:hAnsi="Aptos"/>
+          <w:sz w:val="20"/>
+          <w:szCs w:val="20"/>
+          <w:lang w:val="pt-PT"/>
+        </w:rPr>
+        <w:t>strategy</w:t>
+      </w:r>
+      <w:proofErr w:type="spellEnd"/>
+      <w:r>
+        <w:rPr>
+          <w:rFonts w:ascii="Aptos" w:hAnsi="Aptos"/>
+          <w:sz w:val="20"/>
+          <w:szCs w:val="20"/>
+          <w:lang w:val="pt-PT"/>
+        </w:rPr>
+        <w:t xml:space="preserve"> e </w:t>
+      </w:r>
+      <w:proofErr w:type="spellStart"/>
+      <w:r>
+        <w:rPr>
+          <w:rFonts w:ascii="Aptos" w:hAnsi="Aptos"/>
+          <w:sz w:val="20"/>
+          <w:szCs w:val="20"/>
+          <w:lang w:val="pt-PT"/>
+        </w:rPr>
+        <w:t>strategy_parameters</w:t>
+      </w:r>
+      <w:proofErr w:type="spellEnd"/>
+      <w:r>
+        <w:rPr>
+          <w:rFonts w:ascii="Aptos" w:hAnsi="Aptos"/>
+          <w:sz w:val="20"/>
+          <w:szCs w:val="20"/>
+          <w:lang w:val="pt-PT"/>
+        </w:rPr>
+        <w:t xml:space="preserve"> (por </w:t>
+      </w:r>
+      <w:proofErr w:type="spellStart"/>
+      <w:r>
+        <w:rPr>
+          <w:rFonts w:ascii="Aptos" w:hAnsi="Aptos"/>
+          <w:sz w:val="20"/>
+          <w:szCs w:val="20"/>
+          <w:lang w:val="pt-PT"/>
+        </w:rPr>
+        <w:t>trades_balance</w:t>
+      </w:r>
+      <w:proofErr w:type="spellEnd"/>
+      <w:r>
+        <w:rPr>
+          <w:rFonts w:ascii="Aptos" w:hAnsi="Aptos"/>
+          <w:sz w:val="20"/>
+          <w:szCs w:val="20"/>
+          <w:lang w:val="pt-PT"/>
+        </w:rPr>
+        <w:t xml:space="preserve"> </w:t>
+      </w:r>
+      <w:proofErr w:type="spellStart"/>
+      <w:r>
+        <w:rPr>
+          <w:rFonts w:ascii="Aptos" w:hAnsi="Aptos"/>
+          <w:sz w:val="20"/>
+          <w:szCs w:val="20"/>
+          <w:lang w:val="pt-PT"/>
+        </w:rPr>
+        <w:t>pos</w:t>
+      </w:r>
+      <w:proofErr w:type="spellEnd"/>
+      <w:r>
+        <w:rPr>
+          <w:rFonts w:ascii="Aptos" w:hAnsi="Aptos"/>
+          <w:sz w:val="20"/>
+          <w:szCs w:val="20"/>
+          <w:lang w:val="pt-PT"/>
+        </w:rPr>
+        <w:t>)</w:t>
+      </w:r>
+    </w:p>
+    <w:p>
+      <w:pPr>
+        <w:pStyle w:val="ListParagraph"/>
+        <w:spacing w:line="240" w:lineRule="auto"/>
+        <w:ind w:left="360"/>
+        <w:rPr>
+          <w:rFonts w:ascii="Aptos" w:hAnsi="Aptos"/>
+          <w:sz w:val="20"/>
+          <w:szCs w:val="20"/>
+          <w:lang w:val="pt-PT"/>
+        </w:rPr>
+      </w:pPr>
+    </w:p>
+    <w:p>
+      <w:pPr>
+        <w:pStyle w:val="ListParagraph"/>
+        <w:spacing w:line="240" w:lineRule="auto"/>
+        <w:ind w:left="360"/>
+        <w:rPr>
+          <w:rFonts w:ascii="Aptos" w:hAnsi="Aptos"/>
+          <w:sz w:val="20"/>
+          <w:szCs w:val="20"/>
+        </w:rPr>
+      </w:pPr>
+      <w:r>
+        <w:rPr>
+          <w:rFonts w:ascii="Aptos" w:hAnsi="Aptos"/>
+          <w:sz w:val="20"/>
+          <w:szCs w:val="20"/>
+          <w:lang w:val="pt-PT"/>
+        </w:rPr>
+        <w:tab/>
+      </w:r>
+      <w:r>
+        <w:rPr>
+          <w:rFonts w:ascii="Aptos" w:hAnsi="Aptos"/>
+          <w:sz w:val="20"/>
+          <w:szCs w:val="20"/>
+        </w:rPr>
+        <w:t xml:space="preserve">   [NEW] – </w:t>
+      </w:r>
+      <w:proofErr w:type="spellStart"/>
+      <w:r>
+        <w:rPr>
+          <w:rFonts w:ascii="Aptos" w:hAnsi="Aptos"/>
+          <w:sz w:val="20"/>
+          <w:szCs w:val="20"/>
+        </w:rPr>
+        <w:t>Calcular</w:t>
+      </w:r>
+      <w:proofErr w:type="spellEnd"/>
+      <w:r>
+        <w:rPr>
+          <w:rFonts w:ascii="Aptos" w:hAnsi="Aptos"/>
+          <w:sz w:val="20"/>
+          <w:szCs w:val="20"/>
+        </w:rPr>
+        <w:t xml:space="preserve"> </w:t>
+      </w:r>
+      <w:proofErr w:type="spellStart"/>
+      <w:r>
+        <w:rPr>
+          <w:rFonts w:ascii="Aptos" w:hAnsi="Aptos"/>
+          <w:sz w:val="20"/>
+          <w:szCs w:val="20"/>
+        </w:rPr>
+        <w:t>investimento</w:t>
+      </w:r>
+      <w:proofErr w:type="spellEnd"/>
+      <w:r>
+        <w:rPr>
+          <w:rFonts w:ascii="Aptos" w:hAnsi="Aptos"/>
+          <w:sz w:val="20"/>
+          <w:szCs w:val="20"/>
+        </w:rPr>
+        <w:t xml:space="preserve">: </w:t>
+      </w:r>
+    </w:p>
+    <w:p>
+      <w:pPr>
+        <w:pStyle w:val="ListParagraph"/>
+        <w:spacing w:line="240" w:lineRule="auto"/>
+        <w:ind w:left="1080" w:firstLine="360"/>
+        <w:rPr>
+          <w:rFonts w:ascii="Aptos" w:hAnsi="Aptos"/>
+          <w:sz w:val="20"/>
+          <w:szCs w:val="20"/>
+        </w:rPr>
+      </w:pPr>
+      <w:r>
+        <w:rPr>
+          <w:rFonts w:ascii="Aptos" w:hAnsi="Aptos"/>
+          <w:sz w:val="20"/>
+          <w:szCs w:val="20"/>
+        </w:rPr>
+        <w:t xml:space="preserve">BUY: </w:t>
+      </w:r>
+      <w:r>
+        <w:rPr>
+          <w:rFonts w:ascii="Aptos" w:hAnsi="Aptos"/>
+          <w:sz w:val="20"/>
+          <w:szCs w:val="20"/>
+        </w:rPr>
+        <w:t xml:space="preserve">investment = </w:t>
+      </w:r>
+      <w:proofErr w:type="spellStart"/>
+      <w:r>
+        <w:rPr>
+          <w:rFonts w:ascii="Aptos" w:hAnsi="Aptos"/>
+          <w:sz w:val="20"/>
+          <w:szCs w:val="20"/>
+        </w:rPr>
+        <w:t>in</w:t>
+      </w:r>
+      <w:r>
+        <w:rPr>
+          <w:rFonts w:ascii="Aptos" w:hAnsi="Aptos"/>
+          <w:sz w:val="20"/>
+          <w:szCs w:val="20"/>
+        </w:rPr>
+        <w:t>itial_investment</w:t>
+      </w:r>
+      <w:proofErr w:type="spellEnd"/>
+      <w:r>
+        <w:rPr>
+          <w:rFonts w:ascii="Aptos" w:hAnsi="Aptos"/>
+          <w:sz w:val="20"/>
+          <w:szCs w:val="20"/>
+        </w:rPr>
+        <w:t xml:space="preserve"> * (1 + param2/100)</w:t>
+      </w:r>
+    </w:p>
+    <w:p>
+      <w:pPr>
+        <w:pStyle w:val="ListParagraph"/>
+        <w:spacing w:line="240" w:lineRule="auto"/>
+        <w:ind w:left="1080" w:firstLine="360"/>
+        <w:rPr>
+          <w:rFonts w:ascii="Aptos" w:hAnsi="Aptos"/>
+          <w:sz w:val="20"/>
+          <w:szCs w:val="20"/>
+        </w:rPr>
+      </w:pPr>
+      <w:r>
+        <w:rPr>
+          <w:rFonts w:ascii="Aptos" w:hAnsi="Aptos"/>
+          <w:sz w:val="20"/>
+          <w:szCs w:val="20"/>
+        </w:rPr>
+        <w:t xml:space="preserve">SELL: investment = </w:t>
+      </w:r>
+      <w:proofErr w:type="spellStart"/>
+      <w:r>
+        <w:rPr>
+          <w:rFonts w:ascii="Aptos" w:hAnsi="Aptos"/>
+          <w:sz w:val="20"/>
+          <w:szCs w:val="20"/>
+        </w:rPr>
+        <w:t>initial_investment</w:t>
+      </w:r>
+      <w:proofErr w:type="spellEnd"/>
+      <w:r>
+        <w:rPr>
+          <w:rFonts w:ascii="Aptos" w:hAnsi="Aptos"/>
+          <w:sz w:val="20"/>
+          <w:szCs w:val="20"/>
+        </w:rPr>
+        <w:t xml:space="preserve"> * (1 + param3/100)</w:t>
+      </w:r>
+    </w:p>
+    <w:p>
+      <w:pPr>
+        <w:pStyle w:val="ListParagraph"/>
+        <w:spacing w:line="240" w:lineRule="auto"/>
+        <w:ind w:left="360"/>
+        <w:rPr>
+          <w:rFonts w:ascii="Aptos" w:hAnsi="Aptos"/>
+          <w:sz w:val="20"/>
+          <w:szCs w:val="20"/>
+        </w:rPr>
+      </w:pPr>
+      <w:r>
+        <w:rPr>
+          <w:rFonts w:ascii="Aptos" w:hAnsi="Aptos"/>
+          <w:sz w:val="20"/>
+          <w:szCs w:val="20"/>
+        </w:rPr>
+        <w:tab/>
+      </w:r>
+      <w:r>
+        <w:rPr>
+          <w:rFonts w:ascii="Aptos" w:hAnsi="Aptos"/>
+          <w:sz w:val="20"/>
+          <w:szCs w:val="20"/>
+        </w:rPr>
+        <w:tab/>
+      </w:r>
+    </w:p>
+    <w:p>
+      <w:pPr>
+        <w:pStyle w:val="ListParagraph"/>
+        <w:spacing w:line="240" w:lineRule="auto"/>
+        <w:ind w:left="360"/>
+        <w:rPr>
+          <w:rFonts w:ascii="Aptos" w:hAnsi="Aptos"/>
+          <w:sz w:val="20"/>
+          <w:szCs w:val="20"/>
+          <w:lang w:val="pt-PT"/>
+        </w:rPr>
+      </w:pPr>
+      <w:r>
+        <w:rPr>
+          <w:rFonts w:ascii="Aptos" w:hAnsi="Aptos"/>
+          <w:sz w:val="20"/>
+          <w:szCs w:val="20"/>
+        </w:rPr>
+        <w:t xml:space="preserve">  </w:t>
+      </w:r>
+      <w:r>
+        <w:rPr>
+          <w:rFonts w:ascii="Aptos" w:hAnsi="Aptos"/>
+          <w:sz w:val="20"/>
+          <w:szCs w:val="20"/>
+          <w:lang w:val="pt-PT"/>
+        </w:rPr>
+        <w:t xml:space="preserve">2. Calcular preços: </w:t>
+      </w:r>
+    </w:p>
+    <w:p>
+      <w:pPr>
+        <w:pStyle w:val="ListParagraph"/>
+        <w:spacing w:line="240" w:lineRule="auto"/>
+        <w:ind w:left="360"/>
+        <w:rPr>
+          <w:rFonts w:ascii="Aptos" w:hAnsi="Aptos"/>
+          <w:sz w:val="20"/>
+          <w:szCs w:val="20"/>
+        </w:rPr>
+      </w:pPr>
+      <w:r>
+        <w:rPr>
+          <w:rFonts w:ascii="Aptos" w:hAnsi="Aptos"/>
+          <w:sz w:val="20"/>
+          <w:szCs w:val="20"/>
+          <w:lang w:val="pt-PT"/>
+        </w:rPr>
+        <w:t xml:space="preserve">     </w:t>
+      </w:r>
+      <w:r>
+        <w:rPr>
+          <w:rFonts w:ascii="Aptos" w:hAnsi="Aptos"/>
+          <w:sz w:val="20"/>
+          <w:szCs w:val="20"/>
+        </w:rPr>
+        <w:t xml:space="preserve">- BUY: </w:t>
+      </w:r>
+      <w:proofErr w:type="spellStart"/>
+      <w:r>
+        <w:rPr>
+          <w:rFonts w:ascii="Aptos" w:hAnsi="Aptos"/>
+          <w:sz w:val="20"/>
+          <w:szCs w:val="20"/>
+        </w:rPr>
+        <w:t>current_price</w:t>
+      </w:r>
+      <w:proofErr w:type="spellEnd"/>
+      <w:r>
+        <w:rPr>
+          <w:rFonts w:ascii="Aptos" w:hAnsi="Aptos"/>
+          <w:sz w:val="20"/>
+          <w:szCs w:val="20"/>
+        </w:rPr>
+        <w:t xml:space="preserve"> * (1 + param1/100)</w:t>
+      </w:r>
+    </w:p>
+    <w:p>
+      <w:pPr>
+        <w:pStyle w:val="ListParagraph"/>
+        <w:spacing w:line="240" w:lineRule="auto"/>
+        <w:ind w:left="360"/>
+        <w:rPr>
+          <w:rFonts w:ascii="Aptos" w:hAnsi="Aptos"/>
+          <w:sz w:val="20"/>
+          <w:szCs w:val="20"/>
+        </w:rPr>
+      </w:pPr>
+      <w:r>
+        <w:rPr>
+          <w:rFonts w:ascii="Aptos" w:hAnsi="Aptos"/>
+          <w:sz w:val="20"/>
+          <w:szCs w:val="20"/>
+        </w:rPr>
+        <w:t xml:space="preserve">     - SELL: </w:t>
+      </w:r>
+      <w:proofErr w:type="spellStart"/>
+      <w:r>
+        <w:rPr>
+          <w:rFonts w:ascii="Aptos" w:hAnsi="Aptos"/>
+          <w:sz w:val="20"/>
+          <w:szCs w:val="20"/>
+        </w:rPr>
+        <w:t>current_price</w:t>
+      </w:r>
+      <w:proofErr w:type="spellEnd"/>
+      <w:r>
+        <w:rPr>
+          <w:rFonts w:ascii="Aptos" w:hAnsi="Aptos"/>
+          <w:sz w:val="20"/>
+          <w:szCs w:val="20"/>
+        </w:rPr>
+        <w:t xml:space="preserve"> * (1 + param2/100)</w:t>
+      </w:r>
+    </w:p>
+    <w:p>
+      <w:pPr>
+        <w:pStyle w:val="ListParagraph"/>
+        <w:spacing w:line="240" w:lineRule="auto"/>
+        <w:ind w:left="360"/>
+        <w:rPr>
+          <w:rFonts w:ascii="Aptos" w:hAnsi="Aptos"/>
+          <w:sz w:val="20"/>
+          <w:szCs w:val="20"/>
+        </w:rPr>
+      </w:pPr>
+    </w:p>
+    <w:p>
+      <w:pPr>
+        <w:pStyle w:val="ListParagraph"/>
+        <w:spacing w:line="240" w:lineRule="auto"/>
+        <w:ind w:left="360"/>
+        <w:rPr>
+          <w:rFonts w:ascii="Aptos" w:hAnsi="Aptos"/>
+          <w:sz w:val="20"/>
+          <w:szCs w:val="20"/>
+          <w:lang w:val="pt-PT"/>
+        </w:rPr>
+      </w:pPr>
+      <w:r>
+        <w:rPr>
+          <w:rFonts w:ascii="Aptos" w:hAnsi="Aptos"/>
+          <w:sz w:val="20"/>
+          <w:szCs w:val="20"/>
+        </w:rPr>
+        <w:t xml:space="preserve">  </w:t>
+      </w:r>
+      <w:r>
+        <w:rPr>
+          <w:rFonts w:ascii="Aptos" w:hAnsi="Aptos"/>
+          <w:sz w:val="20"/>
+          <w:szCs w:val="20"/>
+          <w:lang w:val="pt-PT"/>
+        </w:rPr>
+        <w:t xml:space="preserve">3. Calcular quantidades: </w:t>
+      </w:r>
+      <w:proofErr w:type="spellStart"/>
+      <w:r>
+        <w:rPr>
+          <w:rFonts w:ascii="Aptos" w:hAnsi="Aptos"/>
+          <w:sz w:val="20"/>
+          <w:szCs w:val="20"/>
+          <w:lang w:val="pt-PT"/>
+        </w:rPr>
+        <w:t>initial_investment</w:t>
+      </w:r>
+      <w:proofErr w:type="spellEnd"/>
+      <w:r>
+        <w:rPr>
+          <w:rFonts w:ascii="Aptos" w:hAnsi="Aptos"/>
+          <w:sz w:val="20"/>
+          <w:szCs w:val="20"/>
+          <w:lang w:val="pt-PT"/>
+        </w:rPr>
+        <w:t xml:space="preserve"> / preço</w:t>
+      </w:r>
+    </w:p>
+    <w:p>
+      <w:pPr>
+        <w:pStyle w:val="ListParagraph"/>
+        <w:spacing w:line="240" w:lineRule="auto"/>
+        <w:ind w:left="360"/>
+        <w:rPr>
+          <w:rFonts w:ascii="Aptos" w:hAnsi="Aptos"/>
+          <w:sz w:val="20"/>
+          <w:szCs w:val="20"/>
+          <w:lang w:val="pt-PT"/>
+        </w:rPr>
+      </w:pPr>
+    </w:p>
+    <w:p>
+      <w:pPr>
+        <w:pStyle w:val="ListParagraph"/>
+        <w:spacing w:line="240" w:lineRule="auto"/>
+        <w:ind w:left="360" w:firstLine="360"/>
+        <w:rPr>
+          <w:rFonts w:ascii="Aptos" w:hAnsi="Aptos"/>
+          <w:sz w:val="20"/>
+          <w:szCs w:val="20"/>
+          <w:lang w:val="pt-PT"/>
+        </w:rPr>
+      </w:pPr>
+      <w:r>
+        <w:rPr>
+          <w:rFonts w:ascii="Aptos" w:hAnsi="Aptos"/>
+          <w:sz w:val="20"/>
+          <w:szCs w:val="20"/>
+          <w:lang w:val="pt-PT"/>
+        </w:rPr>
+        <w:t xml:space="preserve">[NEW] – Alterar o ponto 3) anterior para </w:t>
+      </w:r>
+      <w:proofErr w:type="spellStart"/>
+      <w:r>
+        <w:rPr>
+          <w:rFonts w:ascii="Aptos" w:hAnsi="Aptos"/>
+          <w:sz w:val="20"/>
+          <w:szCs w:val="20"/>
+          <w:lang w:val="pt-PT"/>
+        </w:rPr>
+        <w:t>investment</w:t>
+      </w:r>
+      <w:proofErr w:type="spellEnd"/>
+      <w:r>
+        <w:rPr>
+          <w:rFonts w:ascii="Aptos" w:hAnsi="Aptos"/>
+          <w:sz w:val="20"/>
+          <w:szCs w:val="20"/>
+          <w:lang w:val="pt-PT"/>
+        </w:rPr>
+        <w:t xml:space="preserve"> / </w:t>
+      </w:r>
+      <w:proofErr w:type="spellStart"/>
+      <w:r>
+        <w:rPr>
+          <w:rFonts w:ascii="Aptos" w:hAnsi="Aptos"/>
+          <w:sz w:val="20"/>
+          <w:szCs w:val="20"/>
+          <w:lang w:val="pt-PT"/>
+        </w:rPr>
+        <w:t>preco</w:t>
+      </w:r>
+      <w:proofErr w:type="spellEnd"/>
+      <w:r>
+        <w:rPr>
+          <w:rFonts w:ascii="Aptos" w:hAnsi="Aptos"/>
+          <w:sz w:val="20"/>
+          <w:szCs w:val="20"/>
+          <w:lang w:val="pt-PT"/>
+        </w:rPr>
+        <w:t xml:space="preserve"> </w:t>
+      </w:r>
+    </w:p>
+    <w:p>
+      <w:pPr>
+        <w:pStyle w:val="ListParagraph"/>
+        <w:spacing w:line="240" w:lineRule="auto"/>
+        <w:ind w:left="360"/>
+        <w:rPr>
+          <w:rFonts w:ascii="Aptos" w:hAnsi="Aptos"/>
+          <w:sz w:val="20"/>
+          <w:szCs w:val="20"/>
+          <w:lang w:val="pt-PT"/>
+        </w:rPr>
+      </w:pPr>
+    </w:p>
+    <w:p>
+      <w:pPr>
+        <w:pStyle w:val="ListParagraph"/>
+        <w:spacing w:line="240" w:lineRule="auto"/>
+        <w:ind w:left="360"/>
+        <w:rPr>
+          <w:rFonts w:ascii="Aptos" w:hAnsi="Aptos"/>
+          <w:sz w:val="20"/>
+          <w:szCs w:val="20"/>
+          <w:lang w:val="pt-PT"/>
+        </w:rPr>
+      </w:pPr>
+    </w:p>
+    <w:p>
+      <w:pPr>
+        <w:pStyle w:val="ListParagraph"/>
+        <w:ind w:left="360"/>
+        <w:rPr>
+          <w:rFonts w:ascii="Aptos" w:hAnsi="Aptos"/>
+          <w:b/>
+          <w:bCs/>
+          <w:sz w:val="20"/>
+          <w:szCs w:val="20"/>
+        </w:rPr>
+      </w:pPr>
+      <w:r>
+        <w:rPr>
+          <w:rFonts w:ascii="Aptos" w:hAnsi="Aptos"/>
+          <w:b/>
+          <w:bCs/>
+          <w:sz w:val="20"/>
+          <w:szCs w:val="20"/>
+        </w:rPr>
+        <w:t>Phase 3: Handle Fills &amp; Rebalance</w:t>
+      </w:r>
+    </w:p>
+    <w:p>
+      <w:pPr>
+        <w:pStyle w:val="ListParagraph"/>
+        <w:spacing w:line="240" w:lineRule="auto"/>
+        <w:ind w:left="360"/>
+        <w:rPr>
+          <w:rFonts w:ascii="Aptos" w:hAnsi="Aptos"/>
+          <w:sz w:val="20"/>
+          <w:szCs w:val="20"/>
+        </w:rPr>
+      </w:pPr>
+    </w:p>
+    <w:p>
+      <w:pPr>
+        <w:pStyle w:val="ListParagraph"/>
+        <w:spacing w:line="240" w:lineRule="auto"/>
+        <w:ind w:left="360"/>
+        <w:rPr>
+          <w:rFonts w:ascii="Aptos" w:hAnsi="Aptos"/>
+          <w:sz w:val="20"/>
+          <w:szCs w:val="20"/>
+          <w:lang w:val="pt-PT"/>
+        </w:rPr>
+      </w:pPr>
+      <w:r>
+        <w:rPr>
+          <w:rFonts w:ascii="Aptos" w:hAnsi="Aptos"/>
+          <w:sz w:val="20"/>
+          <w:szCs w:val="20"/>
+          <w:lang w:val="pt-PT"/>
+        </w:rPr>
+        <w:t xml:space="preserve">Para cada ordem com status=FILLED e </w:t>
+      </w:r>
+      <w:proofErr w:type="spellStart"/>
+      <w:r>
+        <w:rPr>
+          <w:rFonts w:ascii="Aptos" w:hAnsi="Aptos"/>
+          <w:sz w:val="20"/>
+          <w:szCs w:val="20"/>
+          <w:lang w:val="pt-PT"/>
+        </w:rPr>
+        <w:t>automation_status</w:t>
+      </w:r>
+      <w:proofErr w:type="spellEnd"/>
+      <w:r>
+        <w:rPr>
+          <w:rFonts w:ascii="Aptos" w:hAnsi="Aptos"/>
+          <w:sz w:val="20"/>
+          <w:szCs w:val="20"/>
+          <w:lang w:val="pt-PT"/>
+        </w:rPr>
+        <w:t>='</w:t>
+      </w:r>
+      <w:proofErr w:type="gramStart"/>
+      <w:r>
+        <w:rPr>
+          <w:rFonts w:ascii="Aptos" w:hAnsi="Aptos"/>
+          <w:sz w:val="20"/>
+          <w:szCs w:val="20"/>
+          <w:lang w:val="pt-PT"/>
+        </w:rPr>
+        <w:t>E'</w:t>
+      </w:r>
+      <w:proofErr w:type="gramEnd"/>
+      <w:r>
+        <w:rPr>
+          <w:rFonts w:ascii="Aptos" w:hAnsi="Aptos"/>
+          <w:sz w:val="20"/>
+          <w:szCs w:val="20"/>
+          <w:lang w:val="pt-PT"/>
+        </w:rPr>
+        <w:t>:</w:t>
+      </w:r>
+    </w:p>
+    <w:p>
+      <w:pPr>
+        <w:pStyle w:val="ListParagraph"/>
+        <w:spacing w:line="240" w:lineRule="auto"/>
+        <w:ind w:left="360"/>
+        <w:rPr>
+          <w:rFonts w:ascii="Aptos" w:hAnsi="Aptos"/>
+          <w:sz w:val="20"/>
+          <w:szCs w:val="20"/>
+          <w:lang w:val="pt-PT"/>
+        </w:rPr>
+      </w:pPr>
+      <w:r>
+        <w:rPr>
+          <w:rFonts w:ascii="Aptos" w:hAnsi="Aptos"/>
+          <w:sz w:val="20"/>
+          <w:szCs w:val="20"/>
+          <w:lang w:val="pt-PT"/>
+        </w:rPr>
+        <w:t xml:space="preserve">  1. Atualizar ISIN com posição da T212</w:t>
+      </w:r>
+    </w:p>
+    <w:p>
+      <w:pPr>
+        <w:pStyle w:val="ListParagraph"/>
+        <w:spacing w:line="240" w:lineRule="auto"/>
+        <w:ind w:left="360"/>
+        <w:rPr>
+          <w:rFonts w:ascii="Aptos" w:hAnsi="Aptos"/>
+          <w:sz w:val="20"/>
+          <w:szCs w:val="20"/>
+        </w:rPr>
+      </w:pPr>
+      <w:r>
+        <w:rPr>
+          <w:rFonts w:ascii="Aptos" w:hAnsi="Aptos"/>
+          <w:sz w:val="20"/>
+          <w:szCs w:val="20"/>
+          <w:lang w:val="pt-PT"/>
+        </w:rPr>
+        <w:t xml:space="preserve">  </w:t>
+      </w:r>
+      <w:r>
+        <w:rPr>
+          <w:rFonts w:ascii="Aptos" w:hAnsi="Aptos"/>
+          <w:sz w:val="20"/>
+          <w:szCs w:val="20"/>
+        </w:rPr>
+        <w:t xml:space="preserve">2. </w:t>
+      </w:r>
+      <w:proofErr w:type="spellStart"/>
+      <w:r>
+        <w:rPr>
+          <w:rFonts w:ascii="Aptos" w:hAnsi="Aptos"/>
+          <w:sz w:val="20"/>
+          <w:szCs w:val="20"/>
+        </w:rPr>
+        <w:t>Ajustar</w:t>
+      </w:r>
+      <w:proofErr w:type="spellEnd"/>
+      <w:r>
+        <w:rPr>
+          <w:rFonts w:ascii="Aptos" w:hAnsi="Aptos"/>
+          <w:sz w:val="20"/>
+          <w:szCs w:val="20"/>
+        </w:rPr>
+        <w:t xml:space="preserve"> </w:t>
+      </w:r>
+      <w:proofErr w:type="spellStart"/>
+      <w:r>
+        <w:rPr>
+          <w:rFonts w:ascii="Aptos" w:hAnsi="Aptos"/>
+          <w:sz w:val="20"/>
+          <w:szCs w:val="20"/>
+        </w:rPr>
+        <w:t>trades_balance</w:t>
+      </w:r>
+      <w:proofErr w:type="spellEnd"/>
+      <w:r>
+        <w:rPr>
+          <w:rFonts w:ascii="Aptos" w:hAnsi="Aptos"/>
+          <w:sz w:val="20"/>
+          <w:szCs w:val="20"/>
+        </w:rPr>
+        <w:t>:</w:t>
+      </w:r>
+    </w:p>
+    <w:p>
+      <w:pPr>
+        <w:pStyle w:val="ListParagraph"/>
+        <w:spacing w:line="240" w:lineRule="auto"/>
+        <w:ind w:left="360"/>
+        <w:rPr>
+          <w:rFonts w:ascii="Aptos" w:hAnsi="Aptos"/>
+          <w:sz w:val="20"/>
+          <w:szCs w:val="20"/>
+        </w:rPr>
+      </w:pPr>
+      <w:r>
+        <w:rPr>
+          <w:rFonts w:ascii="Aptos" w:hAnsi="Aptos"/>
+          <w:sz w:val="20"/>
+          <w:szCs w:val="20"/>
+        </w:rPr>
+        <w:t xml:space="preserve">     - BUY fill: </w:t>
+      </w:r>
+      <w:proofErr w:type="spellStart"/>
+      <w:r>
+        <w:rPr>
+          <w:rFonts w:ascii="Aptos" w:hAnsi="Aptos"/>
+          <w:sz w:val="20"/>
+          <w:szCs w:val="20"/>
+        </w:rPr>
+        <w:t>trades_balance</w:t>
+      </w:r>
+      <w:proofErr w:type="spellEnd"/>
+      <w:r>
+        <w:rPr>
+          <w:rFonts w:ascii="Aptos" w:hAnsi="Aptos"/>
+          <w:sz w:val="20"/>
+          <w:szCs w:val="20"/>
+        </w:rPr>
+        <w:t xml:space="preserve"> -= 1</w:t>
+      </w:r>
+    </w:p>
+    <w:p>
+      <w:pPr>
+        <w:pStyle w:val="ListParagraph"/>
+        <w:spacing w:line="240" w:lineRule="auto"/>
+        <w:ind w:left="360"/>
+        <w:rPr>
+          <w:rFonts w:ascii="Aptos" w:hAnsi="Aptos"/>
+          <w:sz w:val="20"/>
+          <w:szCs w:val="20"/>
+        </w:rPr>
+      </w:pPr>
+      <w:r>
+        <w:rPr>
+          <w:rFonts w:ascii="Aptos" w:hAnsi="Aptos"/>
+          <w:sz w:val="20"/>
+          <w:szCs w:val="20"/>
+        </w:rPr>
+        <w:t xml:space="preserve">     - SELL </w:t>
+      </w:r>
+      <w:proofErr w:type="gramStart"/>
+      <w:r>
+        <w:rPr>
+          <w:rFonts w:ascii="Aptos" w:hAnsi="Aptos"/>
+          <w:sz w:val="20"/>
+          <w:szCs w:val="20"/>
+        </w:rPr>
+        <w:t>fill</w:t>
+      </w:r>
+      <w:proofErr w:type="gramEnd"/>
+      <w:r>
+        <w:rPr>
+          <w:rFonts w:ascii="Aptos" w:hAnsi="Aptos"/>
+          <w:sz w:val="20"/>
+          <w:szCs w:val="20"/>
+        </w:rPr>
+        <w:t xml:space="preserve">: </w:t>
+      </w:r>
+      <w:proofErr w:type="spellStart"/>
+      <w:r>
+        <w:rPr>
+          <w:rFonts w:ascii="Aptos" w:hAnsi="Aptos"/>
+          <w:sz w:val="20"/>
+          <w:szCs w:val="20"/>
+        </w:rPr>
+        <w:t>trades_balance</w:t>
+      </w:r>
+      <w:proofErr w:type="spellEnd"/>
+      <w:r>
+        <w:rPr>
+          <w:rFonts w:ascii="Aptos" w:hAnsi="Aptos"/>
+          <w:sz w:val="20"/>
+          <w:szCs w:val="20"/>
+        </w:rPr>
+        <w:t xml:space="preserve"> += 1</w:t>
+      </w:r>
+    </w:p>
+    <w:p>
+      <w:pPr>
+        <w:pStyle w:val="ListParagraph"/>
+        <w:spacing w:line="240" w:lineRule="auto"/>
+        <w:ind w:left="360"/>
+        <w:rPr>
+          <w:rFonts w:ascii="Aptos" w:hAnsi="Aptos"/>
+          <w:sz w:val="20"/>
+          <w:szCs w:val="20"/>
+        </w:rPr>
+      </w:pPr>
+      <w:r>
+        <w:rPr>
+          <w:rFonts w:ascii="Aptos" w:hAnsi="Aptos"/>
+          <w:sz w:val="20"/>
+          <w:szCs w:val="20"/>
+        </w:rPr>
+        <w:t xml:space="preserve">  3. </w:t>
+      </w:r>
+      <w:proofErr w:type="spellStart"/>
+      <w:r>
+        <w:rPr>
+          <w:rFonts w:ascii="Aptos" w:hAnsi="Aptos"/>
+          <w:sz w:val="20"/>
+          <w:szCs w:val="20"/>
+        </w:rPr>
+        <w:t>Cancelar</w:t>
+      </w:r>
+      <w:proofErr w:type="spellEnd"/>
+      <w:r>
+        <w:rPr>
+          <w:rFonts w:ascii="Aptos" w:hAnsi="Aptos"/>
+          <w:sz w:val="20"/>
+          <w:szCs w:val="20"/>
+        </w:rPr>
+        <w:t xml:space="preserve"> </w:t>
+      </w:r>
+      <w:proofErr w:type="spellStart"/>
+      <w:r>
+        <w:rPr>
+          <w:rFonts w:ascii="Aptos" w:hAnsi="Aptos"/>
+          <w:sz w:val="20"/>
+          <w:szCs w:val="20"/>
+        </w:rPr>
+        <w:t>related_order_id</w:t>
+      </w:r>
+      <w:proofErr w:type="spellEnd"/>
+    </w:p>
+    <w:p>
+      <w:pPr>
+        <w:pStyle w:val="ListParagraph"/>
+        <w:spacing w:line="240" w:lineRule="auto"/>
+        <w:ind w:left="360"/>
+        <w:rPr>
+          <w:rFonts w:ascii="Aptos" w:hAnsi="Aptos"/>
+          <w:sz w:val="20"/>
+          <w:szCs w:val="20"/>
+          <w:lang w:val="pt-PT"/>
+        </w:rPr>
+      </w:pPr>
+      <w:r>
+        <w:rPr>
+          <w:rFonts w:ascii="Aptos" w:hAnsi="Aptos"/>
+          <w:sz w:val="20"/>
+          <w:szCs w:val="20"/>
+        </w:rPr>
+        <w:t xml:space="preserve">  </w:t>
+      </w:r>
+      <w:r>
+        <w:rPr>
+          <w:rFonts w:ascii="Aptos" w:hAnsi="Aptos"/>
+          <w:sz w:val="20"/>
+          <w:szCs w:val="20"/>
+          <w:lang w:val="pt-PT"/>
+        </w:rPr>
+        <w:t xml:space="preserve">4. Carregar novos </w:t>
+      </w:r>
+      <w:proofErr w:type="spellStart"/>
+      <w:r>
+        <w:rPr>
+          <w:rFonts w:ascii="Aptos" w:hAnsi="Aptos"/>
+          <w:sz w:val="20"/>
+          <w:szCs w:val="20"/>
+          <w:lang w:val="pt-PT"/>
+        </w:rPr>
+        <w:t>strategy_parameters</w:t>
+      </w:r>
+      <w:proofErr w:type="spellEnd"/>
+      <w:r>
+        <w:rPr>
+          <w:rFonts w:ascii="Aptos" w:hAnsi="Aptos"/>
+          <w:sz w:val="20"/>
+          <w:szCs w:val="20"/>
+          <w:lang w:val="pt-PT"/>
+        </w:rPr>
+        <w:t xml:space="preserve"> (nova </w:t>
+      </w:r>
+      <w:proofErr w:type="spellStart"/>
+      <w:r>
+        <w:rPr>
+          <w:rFonts w:ascii="Aptos" w:hAnsi="Aptos"/>
+          <w:sz w:val="20"/>
+          <w:szCs w:val="20"/>
+          <w:lang w:val="pt-PT"/>
+        </w:rPr>
+        <w:t>pos</w:t>
+      </w:r>
+      <w:proofErr w:type="spellEnd"/>
+      <w:r>
+        <w:rPr>
+          <w:rFonts w:ascii="Aptos" w:hAnsi="Aptos"/>
+          <w:sz w:val="20"/>
+          <w:szCs w:val="20"/>
+          <w:lang w:val="pt-PT"/>
+        </w:rPr>
+        <w:t>)</w:t>
+      </w:r>
+    </w:p>
+    <w:p>
+      <w:pPr>
+        <w:pStyle w:val="ListParagraph"/>
+        <w:spacing w:line="240" w:lineRule="auto"/>
+        <w:ind w:left="360"/>
+        <w:rPr>
+          <w:rFonts w:ascii="Aptos" w:hAnsi="Aptos"/>
+          <w:sz w:val="20"/>
+          <w:szCs w:val="20"/>
+          <w:lang w:val="pt-PT"/>
+        </w:rPr>
+      </w:pPr>
+    </w:p>
+    <w:p>
+      <w:pPr>
+        <w:pStyle w:val="ListParagraph"/>
+        <w:spacing w:line="240" w:lineRule="auto"/>
+        <w:ind w:left="360"/>
+        <w:rPr>
+          <w:rFonts w:ascii="Aptos" w:hAnsi="Aptos"/>
+          <w:sz w:val="20"/>
+          <w:szCs w:val="20"/>
+          <w:lang w:val="pt-PT"/>
+        </w:rPr>
+      </w:pPr>
+      <w:r>
+        <w:rPr>
+          <w:rFonts w:ascii="Aptos" w:hAnsi="Aptos"/>
+          <w:sz w:val="20"/>
+          <w:szCs w:val="20"/>
+          <w:lang w:val="pt-PT"/>
+        </w:rPr>
+        <w:tab/>
+      </w:r>
+      <w:r>
+        <w:rPr>
+          <w:rFonts w:ascii="Aptos" w:hAnsi="Aptos"/>
+          <w:sz w:val="20"/>
+          <w:szCs w:val="20"/>
+          <w:lang w:val="pt-PT"/>
+        </w:rPr>
+        <w:t xml:space="preserve">[NEW] – Recalcular </w:t>
+      </w:r>
+      <w:proofErr w:type="spellStart"/>
+      <w:r>
+        <w:rPr>
+          <w:rFonts w:ascii="Aptos" w:hAnsi="Aptos"/>
+          <w:sz w:val="20"/>
+          <w:szCs w:val="20"/>
+          <w:lang w:val="pt-PT"/>
+        </w:rPr>
+        <w:t>investment</w:t>
+      </w:r>
+      <w:proofErr w:type="spellEnd"/>
+      <w:r>
+        <w:rPr>
+          <w:rFonts w:ascii="Aptos" w:hAnsi="Aptos"/>
+          <w:sz w:val="20"/>
+          <w:szCs w:val="20"/>
+          <w:lang w:val="pt-PT"/>
+        </w:rPr>
+        <w:t xml:space="preserve"> com nova </w:t>
+      </w:r>
+      <w:proofErr w:type="spellStart"/>
+      <w:r>
+        <w:rPr>
+          <w:rFonts w:ascii="Aptos" w:hAnsi="Aptos"/>
+          <w:sz w:val="20"/>
+          <w:szCs w:val="20"/>
+          <w:lang w:val="pt-PT"/>
+        </w:rPr>
+        <w:t>p</w:t>
+      </w:r>
+      <w:r>
+        <w:rPr>
+          <w:rFonts w:ascii="Aptos" w:hAnsi="Aptos"/>
+          <w:sz w:val="20"/>
+          <w:szCs w:val="20"/>
+          <w:lang w:val="pt-PT"/>
+        </w:rPr>
+        <w:t>os</w:t>
+      </w:r>
+      <w:proofErr w:type="spellEnd"/>
+    </w:p>
+    <w:p>
+      <w:pPr>
+        <w:pStyle w:val="ListParagraph"/>
+        <w:spacing w:line="240" w:lineRule="auto"/>
+        <w:ind w:left="360"/>
+        <w:rPr>
+          <w:rFonts w:ascii="Aptos" w:hAnsi="Aptos"/>
+          <w:sz w:val="20"/>
+          <w:szCs w:val="20"/>
+        </w:rPr>
+      </w:pPr>
+      <w:r>
+        <w:rPr>
+          <w:rFonts w:ascii="Aptos" w:hAnsi="Aptos"/>
+          <w:sz w:val="20"/>
+          <w:szCs w:val="20"/>
+          <w:lang w:val="pt-PT"/>
+        </w:rPr>
+        <w:tab/>
+      </w:r>
+      <w:r>
+        <w:rPr>
+          <w:rFonts w:ascii="Aptos" w:hAnsi="Aptos"/>
+          <w:sz w:val="20"/>
+          <w:szCs w:val="20"/>
+          <w:lang w:val="pt-PT"/>
+        </w:rPr>
+        <w:tab/>
+      </w:r>
+      <w:r>
+        <w:rPr>
+          <w:rFonts w:ascii="Aptos" w:hAnsi="Aptos"/>
+          <w:sz w:val="20"/>
+          <w:szCs w:val="20"/>
+        </w:rPr>
+        <w:t xml:space="preserve">BUY: investment = </w:t>
+      </w:r>
+      <w:proofErr w:type="spellStart"/>
+      <w:r>
+        <w:rPr>
+          <w:rFonts w:ascii="Aptos" w:hAnsi="Aptos"/>
+          <w:sz w:val="20"/>
+          <w:szCs w:val="20"/>
+        </w:rPr>
+        <w:t>initial_investment</w:t>
+      </w:r>
+      <w:proofErr w:type="spellEnd"/>
+      <w:r>
+        <w:rPr>
+          <w:rFonts w:ascii="Aptos" w:hAnsi="Aptos"/>
+          <w:sz w:val="20"/>
+          <w:szCs w:val="20"/>
+        </w:rPr>
+        <w:t xml:space="preserve"> * (1 + pa</w:t>
+      </w:r>
+      <w:r>
+        <w:rPr>
+          <w:rFonts w:ascii="Aptos" w:hAnsi="Aptos"/>
+          <w:sz w:val="20"/>
+          <w:szCs w:val="20"/>
+        </w:rPr>
+        <w:t>ram2/100)</w:t>
+      </w:r>
+    </w:p>
+    <w:p>
+      <w:pPr>
+        <w:pStyle w:val="ListParagraph"/>
+        <w:spacing w:line="240" w:lineRule="auto"/>
+        <w:ind w:left="1080" w:firstLine="360"/>
+        <w:rPr>
+          <w:rFonts w:ascii="Aptos" w:hAnsi="Aptos"/>
+          <w:sz w:val="20"/>
+          <w:szCs w:val="20"/>
+        </w:rPr>
+      </w:pPr>
+      <w:r>
+        <w:rPr>
+          <w:rFonts w:ascii="Aptos" w:hAnsi="Aptos"/>
+          <w:sz w:val="20"/>
+          <w:szCs w:val="20"/>
+        </w:rPr>
+        <w:t xml:space="preserve">SELL: investment = </w:t>
+      </w:r>
+      <w:proofErr w:type="spellStart"/>
+      <w:r>
+        <w:rPr>
+          <w:rFonts w:ascii="Aptos" w:hAnsi="Aptos"/>
+          <w:sz w:val="20"/>
+          <w:szCs w:val="20"/>
+        </w:rPr>
+        <w:t>initial_investment</w:t>
+      </w:r>
+      <w:proofErr w:type="spellEnd"/>
+      <w:r>
+        <w:rPr>
+          <w:rFonts w:ascii="Aptos" w:hAnsi="Aptos"/>
+          <w:sz w:val="20"/>
+          <w:szCs w:val="20"/>
+        </w:rPr>
+        <w:t xml:space="preserve"> * (1 + param3/100)</w:t>
+      </w:r>
+    </w:p>
+    <w:p>
+      <w:pPr>
+        <w:pStyle w:val="ListParagraph"/>
+        <w:spacing w:line="240" w:lineRule="auto"/>
+        <w:ind w:left="1080" w:firstLine="360"/>
+        <w:rPr>
+          <w:rFonts w:ascii="Aptos" w:hAnsi="Aptos"/>
+          <w:sz w:val="20"/>
+          <w:szCs w:val="20"/>
+        </w:rPr>
+      </w:pPr>
+    </w:p>
+    <w:p>
+      <w:pPr>
+        <w:pStyle w:val="ListParagraph"/>
+        <w:spacing w:line="240" w:lineRule="auto"/>
+        <w:ind w:left="1080" w:firstLine="360"/>
+        <w:rPr>
+          <w:rFonts w:ascii="Aptos" w:hAnsi="Aptos"/>
+          <w:sz w:val="20"/>
+          <w:szCs w:val="20"/>
+          <w:lang w:val="pt-PT"/>
+        </w:rPr>
+      </w:pPr>
+      <w:r>
+        <w:rPr>
+          <w:rFonts w:ascii="Aptos" w:hAnsi="Aptos"/>
+          <w:sz w:val="20"/>
+          <w:szCs w:val="20"/>
+          <w:lang w:val="pt-PT"/>
+        </w:rPr>
+        <w:t xml:space="preserve">Recalcular quantidades com nova </w:t>
+      </w:r>
+      <w:proofErr w:type="spellStart"/>
+      <w:r>
+        <w:rPr>
+          <w:rFonts w:ascii="Aptos" w:hAnsi="Aptos"/>
+          <w:sz w:val="20"/>
+          <w:szCs w:val="20"/>
+          <w:lang w:val="pt-PT"/>
+        </w:rPr>
+        <w:t>po</w:t>
+      </w:r>
+      <w:r>
+        <w:rPr>
+          <w:rFonts w:ascii="Aptos" w:hAnsi="Aptos"/>
+          <w:sz w:val="20"/>
+          <w:szCs w:val="20"/>
+          <w:lang w:val="pt-PT"/>
+        </w:rPr>
+        <w:t>s</w:t>
+      </w:r>
+      <w:proofErr w:type="spellEnd"/>
+      <w:r>
+        <w:rPr>
+          <w:rFonts w:ascii="Aptos" w:hAnsi="Aptos"/>
+          <w:sz w:val="20"/>
+          <w:szCs w:val="20"/>
+          <w:lang w:val="pt-PT"/>
+        </w:rPr>
+        <w:t>:</w:t>
+      </w:r>
+    </w:p>
+    <w:p>
+      <w:pPr>
+        <w:pStyle w:val="ListParagraph"/>
+        <w:spacing w:line="240" w:lineRule="auto"/>
+        <w:ind w:firstLine="720"/>
+        <w:rPr>
+          <w:rFonts w:ascii="Aptos" w:hAnsi="Aptos"/>
+          <w:sz w:val="20"/>
+          <w:szCs w:val="20"/>
+        </w:rPr>
+      </w:pPr>
+      <w:r>
+        <w:rPr>
+          <w:rFonts w:ascii="Aptos" w:hAnsi="Aptos"/>
+          <w:sz w:val="20"/>
+          <w:szCs w:val="20"/>
+        </w:rPr>
+        <w:t xml:space="preserve">BUY: </w:t>
+      </w:r>
+      <w:proofErr w:type="spellStart"/>
+      <w:r>
+        <w:rPr>
+          <w:rFonts w:ascii="Aptos" w:hAnsi="Aptos"/>
+          <w:sz w:val="20"/>
+          <w:szCs w:val="20"/>
+        </w:rPr>
+        <w:t>current_price</w:t>
+      </w:r>
+      <w:proofErr w:type="spellEnd"/>
+      <w:r>
+        <w:rPr>
+          <w:rFonts w:ascii="Aptos" w:hAnsi="Aptos"/>
+          <w:sz w:val="20"/>
+          <w:szCs w:val="20"/>
+        </w:rPr>
+        <w:t xml:space="preserve"> * (1 + param1/100)</w:t>
+      </w:r>
+    </w:p>
+    <w:p>
+      <w:pPr>
+        <w:pStyle w:val="ListParagraph"/>
+        <w:spacing w:line="240" w:lineRule="auto"/>
+        <w:ind w:left="360"/>
+        <w:rPr>
+          <w:rFonts w:ascii="Aptos" w:hAnsi="Aptos"/>
+          <w:sz w:val="20"/>
+          <w:szCs w:val="20"/>
+        </w:rPr>
+      </w:pPr>
+      <w:r>
+        <w:rPr>
+          <w:rFonts w:ascii="Aptos" w:hAnsi="Aptos"/>
+          <w:sz w:val="20"/>
+          <w:szCs w:val="20"/>
+        </w:rPr>
+        <w:t xml:space="preserve">     </w:t>
+      </w:r>
+      <w:r>
+        <w:rPr>
+          <w:rFonts w:ascii="Aptos" w:hAnsi="Aptos"/>
+          <w:sz w:val="20"/>
+          <w:szCs w:val="20"/>
+        </w:rPr>
+        <w:tab/>
+      </w:r>
+      <w:r>
+        <w:rPr>
+          <w:rFonts w:ascii="Aptos" w:hAnsi="Aptos"/>
+          <w:sz w:val="20"/>
+          <w:szCs w:val="20"/>
+        </w:rPr>
+        <w:tab/>
+      </w:r>
+      <w:r>
+        <w:rPr>
+          <w:rFonts w:ascii="Aptos" w:hAnsi="Aptos"/>
+          <w:sz w:val="20"/>
+          <w:szCs w:val="20"/>
+        </w:rPr>
+        <w:t xml:space="preserve">SELL: </w:t>
+      </w:r>
+      <w:proofErr w:type="spellStart"/>
+      <w:r>
+        <w:rPr>
+          <w:rFonts w:ascii="Aptos" w:hAnsi="Aptos"/>
+          <w:sz w:val="20"/>
+          <w:szCs w:val="20"/>
+        </w:rPr>
+        <w:t>current_price</w:t>
+      </w:r>
+      <w:proofErr w:type="spellEnd"/>
+      <w:r>
+        <w:rPr>
+          <w:rFonts w:ascii="Aptos" w:hAnsi="Aptos"/>
+          <w:sz w:val="20"/>
+          <w:szCs w:val="20"/>
+        </w:rPr>
+        <w:t xml:space="preserve"> * (1 + param2/100)</w:t>
+      </w:r>
+    </w:p>
+    <w:p>
+      <w:pPr>
+        <w:pStyle w:val="ListParagraph"/>
+        <w:spacing w:line="240" w:lineRule="auto"/>
+        <w:ind w:left="1080" w:firstLine="360"/>
+        <w:rPr>
+          <w:rFonts w:ascii="Aptos" w:hAnsi="Aptos"/>
+          <w:sz w:val="20"/>
+          <w:szCs w:val="20"/>
+        </w:rPr>
+      </w:pPr>
+    </w:p>
+    <w:p>
+      <w:pPr>
+        <w:pStyle w:val="ListParagraph"/>
+        <w:spacing w:line="240" w:lineRule="auto"/>
+        <w:ind w:left="1800"/>
+        <w:rPr>
+          <w:rFonts w:ascii="Aptos" w:hAnsi="Aptos"/>
+          <w:sz w:val="20"/>
+          <w:szCs w:val="20"/>
+        </w:rPr>
+      </w:pPr>
+    </w:p>
+    <w:p>
+      <w:pPr>
+        <w:pStyle w:val="ListParagraph"/>
+        <w:numPr>
+          <w:ilvl w:val="0"/>
+          <w:numId w:val="3"/>
+        </w:numPr>
+        <w:spacing w:line="240" w:lineRule="auto"/>
+        <w:rPr>
+          <w:rFonts w:ascii="Aptos" w:hAnsi="Aptos"/>
+          <w:sz w:val="20"/>
+          <w:szCs w:val="20"/>
+          <w:lang w:val="pt-PT"/>
+        </w:rPr>
+      </w:pPr>
+      <w:r>
+        <w:rPr>
+          <w:rFonts w:ascii="Aptos" w:hAnsi="Aptos"/>
+          <w:sz w:val="20"/>
+          <w:szCs w:val="20"/>
+          <w:lang w:val="pt-PT"/>
+        </w:rPr>
+        <w:t xml:space="preserve">Colocar novo BUY/SELL </w:t>
+      </w:r>
+      <w:proofErr w:type="spellStart"/>
+      <w:r>
+        <w:rPr>
+          <w:rFonts w:ascii="Aptos" w:hAnsi="Aptos"/>
+          <w:sz w:val="20"/>
+          <w:szCs w:val="20"/>
+          <w:lang w:val="pt-PT"/>
+        </w:rPr>
+        <w:t>pair</w:t>
+      </w:r>
+      <w:proofErr w:type="spellEnd"/>
+      <w:r>
+        <w:rPr>
+          <w:rFonts w:ascii="Aptos" w:hAnsi="Aptos"/>
+          <w:sz w:val="20"/>
+          <w:szCs w:val="20"/>
+          <w:lang w:val="pt-PT"/>
+        </w:rPr>
+        <w:t xml:space="preserve"> (novo </w:t>
+      </w:r>
+      <w:proofErr w:type="spellStart"/>
+      <w:r>
+        <w:rPr>
+          <w:rFonts w:ascii="Aptos" w:hAnsi="Aptos"/>
+          <w:sz w:val="20"/>
+          <w:szCs w:val="20"/>
+          <w:lang w:val="pt-PT"/>
+        </w:rPr>
+        <w:t>grid</w:t>
+      </w:r>
+      <w:proofErr w:type="spellEnd"/>
+      <w:r>
+        <w:rPr>
+          <w:rFonts w:ascii="Aptos" w:hAnsi="Aptos"/>
+          <w:sz w:val="20"/>
+          <w:szCs w:val="20"/>
+          <w:lang w:val="pt-PT"/>
+        </w:rPr>
+        <w:t xml:space="preserve"> </w:t>
+      </w:r>
+      <w:proofErr w:type="spellStart"/>
+      <w:r>
+        <w:rPr>
+          <w:rFonts w:ascii="Aptos" w:hAnsi="Aptos"/>
+          <w:sz w:val="20"/>
+          <w:szCs w:val="20"/>
+          <w:lang w:val="pt-PT"/>
+        </w:rPr>
+        <w:t>level</w:t>
+      </w:r>
+      <w:proofErr w:type="spellEnd"/>
+      <w:r>
+        <w:rPr>
+          <w:rFonts w:ascii="Aptos" w:hAnsi="Aptos"/>
+          <w:sz w:val="20"/>
+          <w:szCs w:val="20"/>
+          <w:lang w:val="pt-PT"/>
+        </w:rPr>
+        <w:t>)</w:t>
+      </w:r>
+    </w:p>
+    <w:p>
+      <w:pPr>
         <w:spacing w:line="240" w:lineRule="auto"/>
         <w:ind w:left="360"/>
         <w:rPr>
@@ -14200,7 +15864,6 @@
   <w:style w:type="character" w:default="1" w:styleId="DefaultParagraphFont">
     <w:name w:val="Default Paragraph Font"/>
     <w:uiPriority w:val="1"/>
-    <w:semiHidden/>
     <w:unhideWhenUsed/>
   </w:style>
   <w:style w:type="table" w:default="1" w:styleId="TableNormal">

</xml_diff>

<commit_message>
feat: Add place_limit_order() method to Trading212Client - Support for limit orders
ADDED:
- place_limit_order(ticker, quantity, limit_price) method in Trading212Client
- Implements POST /equity/orders/limit endpoint from T212 API
- Proper error handling and rate limiting

FIXED:
- Reverted T212Service to correctly call place_limit_order() instead of place_market_order()
- Removed incorrect assumption that T212 doesn't support limit orders

NOTE:
T212 API DOES support limit orders. The issue was simply that the method
wasn't implemented in Trading212Client. Now both market and limit orders are supported.
</commit_message>
<xml_diff>
--- a/my prompts/My Prompts.docx
+++ b/my prompts/My Prompts.docx
@@ -13413,8 +13413,10 @@
           <w:bCs/>
           <w:sz w:val="20"/>
           <w:szCs w:val="20"/>
-        </w:rPr>
-      </w:pPr>
+          <w:lang w:val="pt-PT"/>
+        </w:rPr>
+      </w:pPr>
+      <w:proofErr w:type="spellStart"/>
       <w:r>
         <w:rPr>
           <w:rFonts w:ascii="Aptos" w:hAnsi="Aptos"/>
@@ -13422,53 +13424,75 @@
           <w:bCs/>
           <w:sz w:val="20"/>
           <w:szCs w:val="20"/>
-        </w:rPr>
-        <w:t>Phase 1: Initial Setup</w:t>
-      </w:r>
-    </w:p>
-    <w:p>
-      <w:pPr>
-        <w:pStyle w:val="ListParagraph"/>
-        <w:spacing w:line="240" w:lineRule="auto"/>
-        <w:ind w:left="360"/>
-        <w:rPr>
-          <w:rFonts w:ascii="Aptos" w:hAnsi="Aptos"/>
-          <w:sz w:val="20"/>
-          <w:szCs w:val="20"/>
-        </w:rPr>
-      </w:pPr>
-      <w:r>
-        <w:rPr>
-          <w:rFonts w:ascii="Aptos" w:hAnsi="Aptos"/>
-          <w:sz w:val="20"/>
-          <w:szCs w:val="20"/>
-        </w:rPr>
-        <w:t xml:space="preserve">Para </w:t>
-      </w:r>
-      <w:proofErr w:type="spellStart"/>
-      <w:r>
-        <w:rPr>
-          <w:rFonts w:ascii="Aptos" w:hAnsi="Aptos"/>
-          <w:sz w:val="20"/>
-          <w:szCs w:val="20"/>
-        </w:rPr>
-        <w:t>cada</w:t>
-      </w:r>
-      <w:proofErr w:type="spellEnd"/>
-      <w:r>
-        <w:rPr>
-          <w:rFonts w:ascii="Aptos" w:hAnsi="Aptos"/>
-          <w:sz w:val="20"/>
-          <w:szCs w:val="20"/>
-        </w:rPr>
-        <w:t xml:space="preserve"> ISIN com </w:t>
-      </w:r>
-      <w:proofErr w:type="spellStart"/>
-      <w:r>
-        <w:rPr>
-          <w:rFonts w:ascii="Aptos" w:hAnsi="Aptos"/>
-          <w:sz w:val="20"/>
-          <w:szCs w:val="20"/>
+          <w:lang w:val="pt-PT"/>
+        </w:rPr>
+        <w:t>Phase</w:t>
+      </w:r>
+      <w:proofErr w:type="spellEnd"/>
+      <w:r>
+        <w:rPr>
+          <w:rFonts w:ascii="Aptos" w:hAnsi="Aptos"/>
+          <w:b/>
+          <w:bCs/>
+          <w:sz w:val="20"/>
+          <w:szCs w:val="20"/>
+          <w:lang w:val="pt-PT"/>
+        </w:rPr>
+        <w:t xml:space="preserve"> 1: </w:t>
+      </w:r>
+      <w:proofErr w:type="spellStart"/>
+      <w:r>
+        <w:rPr>
+          <w:rFonts w:ascii="Aptos" w:hAnsi="Aptos"/>
+          <w:b/>
+          <w:bCs/>
+          <w:sz w:val="20"/>
+          <w:szCs w:val="20"/>
+          <w:lang w:val="pt-PT"/>
+        </w:rPr>
+        <w:t>Initial</w:t>
+      </w:r>
+      <w:proofErr w:type="spellEnd"/>
+      <w:r>
+        <w:rPr>
+          <w:rFonts w:ascii="Aptos" w:hAnsi="Aptos"/>
+          <w:b/>
+          <w:bCs/>
+          <w:sz w:val="20"/>
+          <w:szCs w:val="20"/>
+          <w:lang w:val="pt-PT"/>
+        </w:rPr>
+        <w:t xml:space="preserve"> Setup</w:t>
+      </w:r>
+    </w:p>
+    <w:p>
+      <w:pPr>
+        <w:pStyle w:val="ListParagraph"/>
+        <w:spacing w:line="240" w:lineRule="auto"/>
+        <w:ind w:left="360"/>
+        <w:rPr>
+          <w:rFonts w:ascii="Aptos" w:hAnsi="Aptos"/>
+          <w:sz w:val="20"/>
+          <w:szCs w:val="20"/>
+          <w:lang w:val="pt-PT"/>
+        </w:rPr>
+      </w:pPr>
+      <w:r>
+        <w:rPr>
+          <w:rFonts w:ascii="Aptos" w:hAnsi="Aptos"/>
+          <w:sz w:val="20"/>
+          <w:szCs w:val="20"/>
+          <w:lang w:val="pt-PT"/>
+        </w:rPr>
+        <w:t xml:space="preserve">Para cada ISIN com </w:t>
+      </w:r>
+      <w:proofErr w:type="spellStart"/>
+      <w:r>
+        <w:rPr>
+          <w:rFonts w:ascii="Aptos" w:hAnsi="Aptos"/>
+          <w:sz w:val="20"/>
+          <w:szCs w:val="20"/>
+          <w:lang w:val="pt-PT"/>
         </w:rPr>
         <w:t>initial_trade</w:t>
       </w:r>
@@ -13478,6 +13502,7 @@
           <w:rFonts w:ascii="Aptos" w:hAnsi="Aptos"/>
           <w:sz w:val="20"/>
           <w:szCs w:val="20"/>
+          <w:lang w:val="pt-PT"/>
         </w:rPr>
         <w:t>=TRUE:</w:t>
       </w:r>
@@ -13606,6 +13631,7 @@
           <w:rFonts w:ascii="Aptos" w:hAnsi="Aptos"/>
           <w:sz w:val="20"/>
           <w:szCs w:val="20"/>
+          <w:lang w:val="pt-PT"/>
         </w:rPr>
       </w:pPr>
       <w:r>
@@ -13622,44 +13648,9 @@
           <w:rFonts w:ascii="Aptos" w:hAnsi="Aptos"/>
           <w:sz w:val="20"/>
           <w:szCs w:val="20"/>
-        </w:rPr>
-        <w:t xml:space="preserve">   [NEW] – </w:t>
-      </w:r>
-      <w:proofErr w:type="spellStart"/>
-      <w:r>
-        <w:rPr>
-          <w:rFonts w:ascii="Aptos" w:hAnsi="Aptos"/>
-          <w:sz w:val="20"/>
-          <w:szCs w:val="20"/>
-        </w:rPr>
-        <w:t>Calcular</w:t>
-      </w:r>
-      <w:proofErr w:type="spellEnd"/>
-      <w:r>
-        <w:rPr>
-          <w:rFonts w:ascii="Aptos" w:hAnsi="Aptos"/>
-          <w:sz w:val="20"/>
-          <w:szCs w:val="20"/>
-        </w:rPr>
-        <w:t xml:space="preserve"> </w:t>
-      </w:r>
-      <w:proofErr w:type="spellStart"/>
-      <w:r>
-        <w:rPr>
-          <w:rFonts w:ascii="Aptos" w:hAnsi="Aptos"/>
-          <w:sz w:val="20"/>
-          <w:szCs w:val="20"/>
-        </w:rPr>
-        <w:t>investimento</w:t>
-      </w:r>
-      <w:proofErr w:type="spellEnd"/>
-      <w:r>
-        <w:rPr>
-          <w:rFonts w:ascii="Aptos" w:hAnsi="Aptos"/>
-          <w:sz w:val="20"/>
-          <w:szCs w:val="20"/>
-        </w:rPr>
-        <w:t xml:space="preserve">: </w:t>
+          <w:lang w:val="pt-PT"/>
+        </w:rPr>
+        <w:t xml:space="preserve">   [NEW] – Calcular investimento: </w:t>
       </w:r>
     </w:p>
     <w:p>
@@ -13821,6 +13812,7 @@
           <w:rFonts w:ascii="Aptos" w:hAnsi="Aptos"/>
           <w:sz w:val="20"/>
           <w:szCs w:val="20"/>
+          <w:lang w:val="pt-PT"/>
         </w:rPr>
       </w:pPr>
       <w:r>
@@ -13837,6 +13829,7 @@
           <w:rFonts w:ascii="Aptos" w:hAnsi="Aptos"/>
           <w:sz w:val="20"/>
           <w:szCs w:val="20"/>
+          <w:lang w:val="pt-PT"/>
         </w:rPr>
         <w:t xml:space="preserve">- BUY: </w:t>
       </w:r>
@@ -13846,6 +13839,7 @@
           <w:rFonts w:ascii="Aptos" w:hAnsi="Aptos"/>
           <w:sz w:val="20"/>
           <w:szCs w:val="20"/>
+          <w:lang w:val="pt-PT"/>
         </w:rPr>
         <w:t>current_price</w:t>
       </w:r>
@@ -13855,6 +13849,7 @@
           <w:rFonts w:ascii="Aptos" w:hAnsi="Aptos"/>
           <w:sz w:val="20"/>
           <w:szCs w:val="20"/>
+          <w:lang w:val="pt-PT"/>
         </w:rPr>
         <w:t xml:space="preserve"> * (1 + param1/100)</w:t>
       </w:r>
@@ -13868,13 +13863,15 @@
           <w:rFonts w:ascii="Aptos" w:hAnsi="Aptos"/>
           <w:sz w:val="20"/>
           <w:szCs w:val="20"/>
-        </w:rPr>
-      </w:pPr>
-      <w:r>
-        <w:rPr>
-          <w:rFonts w:ascii="Aptos" w:hAnsi="Aptos"/>
-          <w:sz w:val="20"/>
-          <w:szCs w:val="20"/>
+          <w:lang w:val="pt-PT"/>
+        </w:rPr>
+      </w:pPr>
+      <w:r>
+        <w:rPr>
+          <w:rFonts w:ascii="Aptos" w:hAnsi="Aptos"/>
+          <w:sz w:val="20"/>
+          <w:szCs w:val="20"/>
+          <w:lang w:val="pt-PT"/>
         </w:rPr>
         <w:t xml:space="preserve">     - SELL: </w:t>
       </w:r>
@@ -13884,6 +13881,7 @@
           <w:rFonts w:ascii="Aptos" w:hAnsi="Aptos"/>
           <w:sz w:val="20"/>
           <w:szCs w:val="20"/>
+          <w:lang w:val="pt-PT"/>
         </w:rPr>
         <w:t>current_price</w:t>
       </w:r>
@@ -13893,6 +13891,7 @@
           <w:rFonts w:ascii="Aptos" w:hAnsi="Aptos"/>
           <w:sz w:val="20"/>
           <w:szCs w:val="20"/>
+          <w:lang w:val="pt-PT"/>
         </w:rPr>
         <w:t xml:space="preserve"> * (1 + param2/100)</w:t>
       </w:r>
@@ -13906,26 +13905,28 @@
           <w:rFonts w:ascii="Aptos" w:hAnsi="Aptos"/>
           <w:sz w:val="20"/>
           <w:szCs w:val="20"/>
-        </w:rPr>
-      </w:pPr>
-    </w:p>
-    <w:p>
-      <w:pPr>
-        <w:pStyle w:val="ListParagraph"/>
-        <w:spacing w:line="240" w:lineRule="auto"/>
-        <w:ind w:left="360"/>
-        <w:rPr>
-          <w:rFonts w:ascii="Aptos" w:hAnsi="Aptos"/>
-          <w:sz w:val="20"/>
-          <w:szCs w:val="20"/>
-          <w:lang w:val="pt-PT"/>
-        </w:rPr>
-      </w:pPr>
-      <w:r>
-        <w:rPr>
-          <w:rFonts w:ascii="Aptos" w:hAnsi="Aptos"/>
-          <w:sz w:val="20"/>
-          <w:szCs w:val="20"/>
+          <w:lang w:val="pt-PT"/>
+        </w:rPr>
+      </w:pPr>
+    </w:p>
+    <w:p>
+      <w:pPr>
+        <w:pStyle w:val="ListParagraph"/>
+        <w:spacing w:line="240" w:lineRule="auto"/>
+        <w:ind w:left="360"/>
+        <w:rPr>
+          <w:rFonts w:ascii="Aptos" w:hAnsi="Aptos"/>
+          <w:sz w:val="20"/>
+          <w:szCs w:val="20"/>
+          <w:lang w:val="pt-PT"/>
+        </w:rPr>
+      </w:pPr>
+      <w:r>
+        <w:rPr>
+          <w:rFonts w:ascii="Aptos" w:hAnsi="Aptos"/>
+          <w:sz w:val="20"/>
+          <w:szCs w:val="20"/>
+          <w:lang w:val="pt-PT"/>
         </w:rPr>
         <w:t xml:space="preserve">  </w:t>
       </w:r>
@@ -14916,15 +14917,240 @@
     </w:p>
     <w:p>
       <w:pPr>
-        <w:spacing w:line="240" w:lineRule="auto"/>
-        <w:ind w:left="360"/>
-        <w:rPr>
-          <w:rFonts w:ascii="Aptos" w:hAnsi="Aptos"/>
-          <w:sz w:val="20"/>
-          <w:szCs w:val="20"/>
-          <w:lang w:val="pt-PT"/>
-        </w:rPr>
-      </w:pPr>
+        <w:rPr>
+          <w:rFonts w:ascii="Aptos" w:hAnsi="Aptos"/>
+          <w:sz w:val="20"/>
+          <w:szCs w:val="20"/>
+          <w:lang w:val="pt-PT"/>
+        </w:rPr>
+      </w:pPr>
+      <w:r>
+        <w:rPr>
+          <w:rFonts w:ascii="Aptos" w:hAnsi="Aptos"/>
+          <w:sz w:val="20"/>
+          <w:szCs w:val="20"/>
+          <w:lang w:val="pt-PT"/>
+        </w:rPr>
+        <w:br w:type="page"/>
+      </w:r>
+    </w:p>
+    <w:p>
+      <w:pPr>
+        <w:rPr>
+          <w:rFonts w:ascii="Aptos" w:hAnsi="Aptos"/>
+          <w:sz w:val="20"/>
+          <w:szCs w:val="20"/>
+          <w:lang w:val="pt-PT"/>
+        </w:rPr>
+      </w:pPr>
+      <w:r>
+        <w:rPr>
+          <w:rFonts w:ascii="Aptos" w:hAnsi="Aptos"/>
+          <w:sz w:val="20"/>
+          <w:szCs w:val="20"/>
+          <w:lang w:val="pt-PT"/>
+        </w:rPr>
+        <w:lastRenderedPageBreak/>
+        <w:t xml:space="preserve">1) Cria no </w:t>
+      </w:r>
+      <w:proofErr w:type="spellStart"/>
+      <w:r>
+        <w:rPr>
+          <w:rFonts w:ascii="Aptos" w:hAnsi="Aptos"/>
+          <w:sz w:val="20"/>
+          <w:szCs w:val="20"/>
+          <w:lang w:val="pt-PT"/>
+        </w:rPr>
+        <w:t>side</w:t>
+      </w:r>
+      <w:proofErr w:type="spellEnd"/>
+      <w:r>
+        <w:rPr>
+          <w:rFonts w:ascii="Aptos" w:hAnsi="Aptos"/>
+          <w:sz w:val="20"/>
+          <w:szCs w:val="20"/>
+          <w:lang w:val="pt-PT"/>
+        </w:rPr>
+        <w:t xml:space="preserve"> bar do lado esquerdo, um botão que permita correr o </w:t>
+      </w:r>
+      <w:proofErr w:type="spellStart"/>
+      <w:r>
+        <w:rPr>
+          <w:rFonts w:ascii="Aptos" w:hAnsi="Aptos"/>
+          <w:sz w:val="20"/>
+          <w:szCs w:val="20"/>
+          <w:lang w:val="pt-PT"/>
+        </w:rPr>
+        <w:t>AutomationEngine</w:t>
+      </w:r>
+      <w:proofErr w:type="spellEnd"/>
+      <w:r>
+        <w:rPr>
+          <w:rFonts w:ascii="Aptos" w:hAnsi="Aptos"/>
+          <w:sz w:val="20"/>
+          <w:szCs w:val="20"/>
+          <w:lang w:val="pt-PT"/>
+        </w:rPr>
+        <w:t xml:space="preserve"> UMA SÓ VEZ</w:t>
+      </w:r>
+    </w:p>
+    <w:p>
+      <w:pPr>
+        <w:rPr>
+          <w:rFonts w:ascii="Aptos" w:hAnsi="Aptos"/>
+          <w:sz w:val="20"/>
+          <w:szCs w:val="20"/>
+          <w:lang w:val="pt-PT"/>
+        </w:rPr>
+      </w:pPr>
+      <w:r>
+        <w:rPr>
+          <w:rFonts w:ascii="Aptos" w:hAnsi="Aptos"/>
+          <w:sz w:val="20"/>
+          <w:szCs w:val="20"/>
+          <w:lang w:val="pt-PT"/>
+        </w:rPr>
+        <w:t xml:space="preserve">2) Cria uma coluna na tabela </w:t>
+      </w:r>
+      <w:proofErr w:type="spellStart"/>
+      <w:r>
+        <w:rPr>
+          <w:rFonts w:ascii="Aptos" w:hAnsi="Aptos"/>
+          <w:sz w:val="20"/>
+          <w:szCs w:val="20"/>
+          <w:lang w:val="pt-PT"/>
+        </w:rPr>
+        <w:t>app_parameters</w:t>
+      </w:r>
+      <w:proofErr w:type="spellEnd"/>
+      <w:r>
+        <w:rPr>
+          <w:rFonts w:ascii="Aptos" w:hAnsi="Aptos"/>
+          <w:sz w:val="20"/>
+          <w:szCs w:val="20"/>
+          <w:lang w:val="pt-PT"/>
+        </w:rPr>
+        <w:t xml:space="preserve">, denominada </w:t>
+      </w:r>
+      <w:proofErr w:type="spellStart"/>
+      <w:r>
+        <w:rPr>
+          <w:rFonts w:ascii="Aptos" w:hAnsi="Aptos"/>
+          <w:sz w:val="20"/>
+          <w:szCs w:val="20"/>
+          <w:lang w:val="pt-PT"/>
+        </w:rPr>
+        <w:t>log_level</w:t>
+      </w:r>
+      <w:proofErr w:type="spellEnd"/>
+      <w:r>
+        <w:rPr>
+          <w:rFonts w:ascii="Aptos" w:hAnsi="Aptos"/>
+          <w:sz w:val="20"/>
+          <w:szCs w:val="20"/>
+          <w:lang w:val="pt-PT"/>
+        </w:rPr>
+        <w:t>. Valores possíveis “OFF/LOW/MEDIUM/HIGH”.</w:t>
+      </w:r>
+    </w:p>
+    <w:p>
+      <w:pPr>
+        <w:rPr>
+          <w:rFonts w:ascii="Aptos" w:hAnsi="Aptos"/>
+          <w:sz w:val="20"/>
+          <w:szCs w:val="20"/>
+          <w:lang w:val="pt-PT"/>
+        </w:rPr>
+      </w:pPr>
+      <w:r>
+        <w:rPr>
+          <w:rFonts w:ascii="Aptos" w:hAnsi="Aptos"/>
+          <w:sz w:val="20"/>
+          <w:szCs w:val="20"/>
+          <w:lang w:val="pt-PT"/>
+        </w:rPr>
+        <w:t xml:space="preserve">3) </w:t>
+      </w:r>
+      <w:proofErr w:type="spellStart"/>
+      <w:r>
+        <w:rPr>
+          <w:rFonts w:ascii="Aptos" w:hAnsi="Aptos"/>
+          <w:sz w:val="20"/>
+          <w:szCs w:val="20"/>
+          <w:lang w:val="pt-PT"/>
+        </w:rPr>
+        <w:t>AutomationEngine</w:t>
+      </w:r>
+      <w:proofErr w:type="spellEnd"/>
+      <w:r>
+        <w:rPr>
+          <w:rFonts w:ascii="Aptos" w:hAnsi="Aptos"/>
+          <w:sz w:val="20"/>
+          <w:szCs w:val="20"/>
+          <w:lang w:val="pt-PT"/>
+        </w:rPr>
+        <w:t xml:space="preserve"> cria </w:t>
+      </w:r>
+      <w:proofErr w:type="spellStart"/>
+      <w:r>
+        <w:rPr>
+          <w:rFonts w:ascii="Aptos" w:hAnsi="Aptos"/>
+          <w:sz w:val="20"/>
+          <w:szCs w:val="20"/>
+          <w:lang w:val="pt-PT"/>
+        </w:rPr>
+        <w:t>logs</w:t>
+      </w:r>
+      <w:proofErr w:type="spellEnd"/>
+      <w:r>
+        <w:rPr>
+          <w:rFonts w:ascii="Aptos" w:hAnsi="Aptos"/>
+          <w:sz w:val="20"/>
+          <w:szCs w:val="20"/>
+          <w:lang w:val="pt-PT"/>
+        </w:rPr>
+        <w:t xml:space="preserve"> em todas as interações com a base de dados e com a T212 API, a dizeres o que vais fazer antes e o resultado depois. Estes </w:t>
+      </w:r>
+      <w:proofErr w:type="spellStart"/>
+      <w:r>
+        <w:rPr>
+          <w:rFonts w:ascii="Aptos" w:hAnsi="Aptos"/>
+          <w:sz w:val="20"/>
+          <w:szCs w:val="20"/>
+          <w:lang w:val="pt-PT"/>
+        </w:rPr>
+        <w:t>logs</w:t>
+      </w:r>
+      <w:proofErr w:type="spellEnd"/>
+      <w:r>
+        <w:rPr>
+          <w:rFonts w:ascii="Aptos" w:hAnsi="Aptos"/>
+          <w:sz w:val="20"/>
+          <w:szCs w:val="20"/>
+          <w:lang w:val="pt-PT"/>
+        </w:rPr>
+        <w:t xml:space="preserve"> devem ser criados apenas se o </w:t>
+      </w:r>
+      <w:proofErr w:type="spellStart"/>
+      <w:r>
+        <w:rPr>
+          <w:rFonts w:ascii="Aptos" w:hAnsi="Aptos"/>
+          <w:sz w:val="20"/>
+          <w:szCs w:val="20"/>
+          <w:lang w:val="pt-PT"/>
+        </w:rPr>
+        <w:t>log_level</w:t>
+      </w:r>
+      <w:proofErr w:type="spellEnd"/>
+      <w:r>
+        <w:rPr>
+          <w:rFonts w:ascii="Aptos" w:hAnsi="Aptos"/>
+          <w:sz w:val="20"/>
+          <w:szCs w:val="20"/>
+          <w:lang w:val="pt-PT"/>
+        </w:rPr>
+        <w:t xml:space="preserve"> for MEDIUM. </w:t>
+      </w:r>
     </w:p>
     <w:sectPr>
       <w:pgSz w:w="12240" w:h="15840"/>
@@ -15864,6 +16090,7 @@
   <w:style w:type="character" w:default="1" w:styleId="DefaultParagraphFont">
     <w:name w:val="Default Paragraph Font"/>
     <w:uiPriority w:val="1"/>
+    <w:semiHidden/>
     <w:unhideWhenUsed/>
   </w:style>
   <w:style w:type="table" w:default="1" w:styleId="TableNormal">

</xml_diff>